<commit_message>
move supplements around a bit again
</commit_message>
<xml_diff>
--- a/Supplement-Pillbox-Guide.docx
+++ b/Supplement-Pillbox-Guide.docx
@@ -177,21 +177,6 @@
           </w:p>
           <w:p>
             <w:pPr>
-              <w:spacing w:before="0" w:after="40" w:line="228" w:lineRule="auto"/>
-              <w:jc w:val="center"/>
-            </w:pPr>
-            <w:r>
-              <w:rPr>
-                <w:rFonts w:ascii="Aptos" w:hAnsi="Aptos" w:eastAsia="Aptos" w:cs="Aptos"/>
-                <w:b w:val="0"/>
-                <w:color w:val="536176"/>
-                <w:sz w:val="16"/>
-              </w:rPr>
-              <w:t>1pill</w:t>
-            </w:r>
-          </w:p>
-          <w:p>
-            <w:pPr>
               <w:spacing w:before="0" w:after="20" w:line="240" w:lineRule="auto"/>
               <w:jc w:val="center"/>
             </w:pPr>
@@ -267,21 +252,6 @@
                 <w:sz w:val="18"/>
               </w:rPr>
               <w:t>200mln CFU</w:t>
-            </w:r>
-          </w:p>
-          <w:p>
-            <w:pPr>
-              <w:spacing w:before="0" w:after="40" w:line="228" w:lineRule="auto"/>
-              <w:jc w:val="center"/>
-            </w:pPr>
-            <w:r>
-              <w:rPr>
-                <w:rFonts w:ascii="Aptos" w:hAnsi="Aptos" w:eastAsia="Aptos" w:cs="Aptos"/>
-                <w:b w:val="0"/>
-                <w:color w:val="536176"/>
-                <w:sz w:val="16"/>
-              </w:rPr>
-              <w:t>1pill</w:t>
             </w:r>
           </w:p>
           <w:p>
@@ -450,21 +420,6 @@
           </w:p>
           <w:p>
             <w:pPr>
-              <w:spacing w:before="0" w:after="40" w:line="228" w:lineRule="auto"/>
-              <w:jc w:val="center"/>
-            </w:pPr>
-            <w:r>
-              <w:rPr>
-                <w:rFonts w:ascii="Aptos" w:hAnsi="Aptos" w:eastAsia="Aptos" w:cs="Aptos"/>
-                <w:b w:val="0"/>
-                <w:color w:val="536176"/>
-                <w:sz w:val="16"/>
-              </w:rPr>
-              <w:t>1pill</w:t>
-            </w:r>
-          </w:p>
-          <w:p>
-            <w:pPr>
               <w:spacing w:before="0" w:after="20" w:line="240" w:lineRule="auto"/>
               <w:jc w:val="center"/>
             </w:pPr>
@@ -559,21 +514,6 @@
           </w:p>
           <w:p>
             <w:pPr>
-              <w:spacing w:before="0" w:after="40" w:line="228" w:lineRule="auto"/>
-              <w:jc w:val="center"/>
-            </w:pPr>
-            <w:r>
-              <w:rPr>
-                <w:rFonts w:ascii="Aptos" w:hAnsi="Aptos" w:eastAsia="Aptos" w:cs="Aptos"/>
-                <w:b w:val="0"/>
-                <w:color w:val="536176"/>
-                <w:sz w:val="16"/>
-              </w:rPr>
-              <w:t>large tablet • 1 of 2</w:t>
-            </w:r>
-          </w:p>
-          <w:p>
-            <w:pPr>
               <w:spacing w:before="0" w:after="20" w:line="240" w:lineRule="auto"/>
               <w:jc w:val="center"/>
             </w:pPr>
@@ -649,21 +589,6 @@
                 <w:sz w:val="18"/>
               </w:rPr>
               <w:t>750mg</w:t>
-            </w:r>
-          </w:p>
-          <w:p>
-            <w:pPr>
-              <w:spacing w:before="0" w:after="40" w:line="228" w:lineRule="auto"/>
-              <w:jc w:val="center"/>
-            </w:pPr>
-            <w:r>
-              <w:rPr>
-                <w:rFonts w:ascii="Aptos" w:hAnsi="Aptos" w:eastAsia="Aptos" w:cs="Aptos"/>
-                <w:b w:val="0"/>
-                <w:color w:val="536176"/>
-                <w:sz w:val="16"/>
-              </w:rPr>
-              <w:t>large tablet • 2 of 2</w:t>
             </w:r>
           </w:p>
           <w:p>
@@ -817,21 +742,6 @@
           </w:p>
           <w:p>
             <w:pPr>
-              <w:spacing w:before="0" w:after="40" w:line="228" w:lineRule="auto"/>
-              <w:jc w:val="center"/>
-            </w:pPr>
-            <w:r>
-              <w:rPr>
-                <w:rFonts w:ascii="Aptos" w:hAnsi="Aptos" w:eastAsia="Aptos" w:cs="Aptos"/>
-                <w:b w:val="0"/>
-                <w:color w:val="536176"/>
-                <w:sz w:val="16"/>
-              </w:rPr>
-              <w:t>1pill</w:t>
-            </w:r>
-          </w:p>
-          <w:p>
-            <w:pPr>
               <w:spacing w:before="0" w:after="20" w:line="240" w:lineRule="auto"/>
               <w:jc w:val="center"/>
             </w:pPr>
@@ -906,22 +816,7 @@
                 <w:color w:val="176B87"/>
                 <w:sz w:val="18"/>
               </w:rPr>
-              <w:t>500mg each • 1,000mg total</w:t>
-            </w:r>
-          </w:p>
-          <w:p>
-            <w:pPr>
-              <w:spacing w:before="0" w:after="40" w:line="228" w:lineRule="auto"/>
-              <w:jc w:val="center"/>
-            </w:pPr>
-            <w:r>
-              <w:rPr>
-                <w:rFonts w:ascii="Aptos" w:hAnsi="Aptos" w:eastAsia="Aptos" w:cs="Aptos"/>
-                <w:b w:val="0"/>
-                <w:color w:val="536176"/>
-                <w:sz w:val="16"/>
-              </w:rPr>
-              <w:t>capsules together</w:t>
+              <w:t>500mg each</w:t>
             </w:r>
           </w:p>
           <w:p>
@@ -961,15 +856,6 @@
         <w:spacing w:before="60" w:after="0" w:line="240" w:lineRule="auto"/>
         <w:jc w:val="left"/>
       </w:pPr>
-      <w:r>
-        <w:rPr>
-          <w:rFonts w:ascii="Aptos" w:hAnsi="Aptos" w:eastAsia="Aptos" w:cs="Aptos"/>
-          <w:b w:val="0"/>
-          <w:color w:val="536176"/>
-          <w:sz w:val="14"/>
-        </w:rPr>
-        <w:t xml:space="preserve">One numbered cell = one physical compartment • </w:t>
-      </w:r>
       <w:hyperlink r:id="rId11">
         <w:r>
           <w:rPr>
@@ -1084,7 +970,7 @@
           <w:color w:val="536176"/>
           <w:sz w:val="16"/>
         </w:rPr>
-        <w:t>M.15 holds all three small NR capsules together; ranges elsewhere mean separate compartments.</w:t>
+        <w:t>M.15 holds all three small NR capsules together.</w:t>
       </w:r>
     </w:p>
     <w:tbl>
@@ -1169,21 +1055,6 @@
           </w:p>
           <w:p>
             <w:pPr>
-              <w:spacing w:before="0" w:after="40" w:line="228" w:lineRule="auto"/>
-              <w:jc w:val="center"/>
-            </w:pPr>
-            <w:r>
-              <w:rPr>
-                <w:rFonts w:ascii="Aptos" w:hAnsi="Aptos" w:eastAsia="Aptos" w:cs="Aptos"/>
-                <w:b w:val="0"/>
-                <w:color w:val="536176"/>
-                <w:sz w:val="16"/>
-              </w:rPr>
-              <w:t>1pill</w:t>
-            </w:r>
-          </w:p>
-          <w:p>
-            <w:pPr>
               <w:spacing w:before="0" w:after="20" w:line="240" w:lineRule="auto"/>
               <w:jc w:val="center"/>
             </w:pPr>
@@ -1208,7 +1079,7 @@
                 <w:color w:val="536176"/>
                 <w:sz w:val="15"/>
               </w:rPr>
-              <w:t>Vitamin C 5mg</w:t>
+              <w:t>ErgoActive® • Vitamin C 5mg</w:t>
             </w:r>
           </w:p>
         </w:tc>
@@ -1274,21 +1145,6 @@
                 <w:sz w:val="18"/>
               </w:rPr>
               <w:t>1,000mg</w:t>
-            </w:r>
-          </w:p>
-          <w:p>
-            <w:pPr>
-              <w:spacing w:before="0" w:after="40" w:line="228" w:lineRule="auto"/>
-              <w:jc w:val="center"/>
-            </w:pPr>
-            <w:r>
-              <w:rPr>
-                <w:rFonts w:ascii="Aptos" w:hAnsi="Aptos" w:eastAsia="Aptos" w:cs="Aptos"/>
-                <w:b w:val="0"/>
-                <w:color w:val="536176"/>
-                <w:sz w:val="16"/>
-              </w:rPr>
-              <w:t>1pill</w:t>
             </w:r>
           </w:p>
           <w:p>
@@ -1442,21 +1298,6 @@
           </w:p>
           <w:p>
             <w:pPr>
-              <w:spacing w:before="0" w:after="40" w:line="228" w:lineRule="auto"/>
-              <w:jc w:val="center"/>
-            </w:pPr>
-            <w:r>
-              <w:rPr>
-                <w:rFonts w:ascii="Aptos" w:hAnsi="Aptos" w:eastAsia="Aptos" w:cs="Aptos"/>
-                <w:b w:val="0"/>
-                <w:color w:val="536176"/>
-                <w:sz w:val="16"/>
-              </w:rPr>
-              <w:t>1pill</w:t>
-            </w:r>
-          </w:p>
-          <w:p>
-            <w:pPr>
               <w:spacing w:before="0" w:after="20" w:line="240" w:lineRule="auto"/>
               <w:jc w:val="center"/>
             </w:pPr>
@@ -1538,21 +1379,6 @@
           </w:p>
           <w:p>
             <w:pPr>
-              <w:spacing w:before="0" w:after="40" w:line="228" w:lineRule="auto"/>
-              <w:jc w:val="center"/>
-            </w:pPr>
-            <w:r>
-              <w:rPr>
-                <w:rFonts w:ascii="Aptos" w:hAnsi="Aptos" w:eastAsia="Aptos" w:cs="Aptos"/>
-                <w:b w:val="0"/>
-                <w:color w:val="536176"/>
-                <w:sz w:val="16"/>
-              </w:rPr>
-              <w:t>1pill</w:t>
-            </w:r>
-          </w:p>
-          <w:p>
-            <w:pPr>
               <w:spacing w:before="0" w:after="20" w:line="240" w:lineRule="auto"/>
               <w:jc w:val="center"/>
             </w:pPr>
@@ -1627,22 +1453,7 @@
                 <w:color w:val="176B87"/>
                 <w:sz w:val="18"/>
               </w:rPr>
-              <w:t>300mg each • 900mg total</w:t>
-            </w:r>
-          </w:p>
-          <w:p>
-            <w:pPr>
-              <w:spacing w:before="0" w:after="40" w:line="228" w:lineRule="auto"/>
-              <w:jc w:val="center"/>
-            </w:pPr>
-            <w:r>
-              <w:rPr>
-                <w:rFonts w:ascii="Aptos" w:hAnsi="Aptos" w:eastAsia="Aptos" w:cs="Aptos"/>
-                <w:b w:val="0"/>
-                <w:color w:val="536176"/>
-                <w:sz w:val="16"/>
-              </w:rPr>
-              <w:t>small capsules together</w:t>
+              <w:t>300mg each</w:t>
             </w:r>
           </w:p>
           <w:p>
@@ -1861,21 +1672,6 @@
           </w:p>
           <w:p>
             <w:pPr>
-              <w:spacing w:before="0" w:after="40" w:line="228" w:lineRule="auto"/>
-              <w:jc w:val="center"/>
-            </w:pPr>
-            <w:r>
-              <w:rPr>
-                <w:rFonts w:ascii="Aptos" w:hAnsi="Aptos" w:eastAsia="Aptos" w:cs="Aptos"/>
-                <w:b w:val="0"/>
-                <w:color w:val="536176"/>
-                <w:sz w:val="16"/>
-              </w:rPr>
-              <w:t>1pill</w:t>
-            </w:r>
-          </w:p>
-          <w:p>
-            <w:pPr>
               <w:spacing w:before="0" w:after="20" w:line="240" w:lineRule="auto"/>
               <w:jc w:val="center"/>
             </w:pPr>
@@ -1911,15 +1707,6 @@
         <w:spacing w:before="60" w:after="0" w:line="240" w:lineRule="auto"/>
         <w:jc w:val="left"/>
       </w:pPr>
-      <w:r>
-        <w:rPr>
-          <w:rFonts w:ascii="Aptos" w:hAnsi="Aptos" w:eastAsia="Aptos" w:cs="Aptos"/>
-          <w:b w:val="0"/>
-          <w:color w:val="536176"/>
-          <w:sz w:val="14"/>
-        </w:rPr>
-        <w:t xml:space="preserve">One numbered cell = one physical compartment • </w:t>
-      </w:r>
       <w:hyperlink r:id="rId11">
         <w:r>
           <w:rPr>
@@ -2034,7 +1821,7 @@
           <w:color w:val="536176"/>
           <w:sz w:val="16"/>
         </w:rPr>
-        <w:t>L.1 is one divided compartment. Omega-3 is conditional and occupies three large-softgel slots.</w:t>
+        <w:t>Omega-3 is conditional: use L.2–L.4 on non-Fatty-Fish days only.</w:t>
       </w:r>
     </w:p>
     <w:tbl>
@@ -2083,7 +1870,7 @@
                 <w:color w:val="9D2449"/>
                 <w:sz w:val="19"/>
               </w:rPr>
-              <w:t>L.1 • SHARED SLOT</w:t>
+              <w:t>L.1</w:t>
             </w:r>
           </w:p>
           <w:tbl>
@@ -2160,21 +1947,6 @@
                       <w:sz w:val="18"/>
                     </w:rPr>
                     <w:t>10mg</w:t>
-                  </w:r>
-                </w:p>
-                <w:p>
-                  <w:pPr>
-                    <w:spacing w:before="0" w:after="40" w:line="228" w:lineRule="auto"/>
-                    <w:jc w:val="center"/>
-                  </w:pPr>
-                  <w:r>
-                    <w:rPr>
-                      <w:rFonts w:ascii="Aptos" w:hAnsi="Aptos" w:eastAsia="Aptos" w:cs="Aptos"/>
-                      <w:b w:val="0"/>
-                      <w:color w:val="536176"/>
-                      <w:sz w:val="16"/>
-                    </w:rPr>
-                    <w:t>1pill</w:t>
                   </w:r>
                 </w:p>
                 <w:p>
@@ -2258,21 +2030,6 @@
                 </w:p>
                 <w:p>
                   <w:pPr>
-                    <w:spacing w:before="0" w:after="40" w:line="228" w:lineRule="auto"/>
-                    <w:jc w:val="center"/>
-                  </w:pPr>
-                  <w:r>
-                    <w:rPr>
-                      <w:rFonts w:ascii="Aptos" w:hAnsi="Aptos" w:eastAsia="Aptos" w:cs="Aptos"/>
-                      <w:b w:val="0"/>
-                      <w:color w:val="536176"/>
-                      <w:sz w:val="16"/>
-                    </w:rPr>
-                    <w:t>1pill</w:t>
-                  </w:r>
-                </w:p>
-                <w:p>
-                  <w:pPr>
                     <w:spacing w:before="0" w:after="20" w:line="240" w:lineRule="auto"/>
                     <w:jc w:val="center"/>
                   </w:pPr>
@@ -2352,21 +2109,6 @@
                 <w:sz w:val="18"/>
               </w:rPr>
               <w:t>EPA 500mg • DHA 250mg</w:t>
-            </w:r>
-          </w:p>
-          <w:p>
-            <w:pPr>
-              <w:spacing w:before="0" w:after="40" w:line="228" w:lineRule="auto"/>
-              <w:jc w:val="center"/>
-            </w:pPr>
-            <w:r>
-              <w:rPr>
-                <w:rFonts w:ascii="Aptos" w:hAnsi="Aptos" w:eastAsia="Aptos" w:cs="Aptos"/>
-                <w:b w:val="0"/>
-                <w:color w:val="536176"/>
-                <w:sz w:val="16"/>
-              </w:rPr>
-              <w:t>large softgel • 1 of 3</w:t>
             </w:r>
           </w:p>
           <w:p>
@@ -2461,21 +2203,6 @@
                 <w:sz w:val="18"/>
               </w:rPr>
               <w:t>EPA 500mg • DHA 250mg</w:t>
-            </w:r>
-          </w:p>
-          <w:p>
-            <w:pPr>
-              <w:spacing w:before="0" w:after="40" w:line="228" w:lineRule="auto"/>
-              <w:jc w:val="center"/>
-            </w:pPr>
-            <w:r>
-              <w:rPr>
-                <w:rFonts w:ascii="Aptos" w:hAnsi="Aptos" w:eastAsia="Aptos" w:cs="Aptos"/>
-                <w:b w:val="0"/>
-                <w:color w:val="536176"/>
-                <w:sz w:val="16"/>
-              </w:rPr>
-              <w:t>large softgel • 2 of 3</w:t>
             </w:r>
           </w:p>
           <w:p>
@@ -2579,21 +2306,6 @@
           </w:p>
           <w:p>
             <w:pPr>
-              <w:spacing w:before="0" w:after="40" w:line="228" w:lineRule="auto"/>
-              <w:jc w:val="center"/>
-            </w:pPr>
-            <w:r>
-              <w:rPr>
-                <w:rFonts w:ascii="Aptos" w:hAnsi="Aptos" w:eastAsia="Aptos" w:cs="Aptos"/>
-                <w:b w:val="0"/>
-                <w:color w:val="536176"/>
-                <w:sz w:val="16"/>
-              </w:rPr>
-              <w:t>large softgel • 3 of 3</w:t>
-            </w:r>
-          </w:p>
-          <w:p>
-            <w:pPr>
               <w:spacing w:before="0" w:after="20" w:line="240" w:lineRule="auto"/>
               <w:jc w:val="center"/>
             </w:pPr>
@@ -2684,21 +2396,6 @@
                 <w:sz w:val="18"/>
               </w:rPr>
               <w:t>500mg</w:t>
-            </w:r>
-          </w:p>
-          <w:p>
-            <w:pPr>
-              <w:spacing w:before="0" w:after="40" w:line="228" w:lineRule="auto"/>
-              <w:jc w:val="center"/>
-            </w:pPr>
-            <w:r>
-              <w:rPr>
-                <w:rFonts w:ascii="Aptos" w:hAnsi="Aptos" w:eastAsia="Aptos" w:cs="Aptos"/>
-                <w:b w:val="0"/>
-                <w:color w:val="536176"/>
-                <w:sz w:val="16"/>
-              </w:rPr>
-              <w:t>1pill</w:t>
             </w:r>
           </w:p>
           <w:p>
@@ -2797,21 +2494,6 @@
           </w:p>
           <w:p>
             <w:pPr>
-              <w:spacing w:before="0" w:after="40" w:line="228" w:lineRule="auto"/>
-              <w:jc w:val="center"/>
-            </w:pPr>
-            <w:r>
-              <w:rPr>
-                <w:rFonts w:ascii="Aptos" w:hAnsi="Aptos" w:eastAsia="Aptos" w:cs="Aptos"/>
-                <w:b w:val="0"/>
-                <w:color w:val="536176"/>
-                <w:sz w:val="16"/>
-              </w:rPr>
-              <w:t>large capsule • 1 of 2</w:t>
-            </w:r>
-          </w:p>
-          <w:p>
-            <w:pPr>
               <w:spacing w:before="0" w:after="20" w:line="240" w:lineRule="auto"/>
               <w:jc w:val="center"/>
             </w:pPr>
@@ -2892,21 +2574,6 @@
                 <w:sz w:val="18"/>
               </w:rPr>
               <w:t>250mg</w:t>
-            </w:r>
-          </w:p>
-          <w:p>
-            <w:pPr>
-              <w:spacing w:before="0" w:after="40" w:line="228" w:lineRule="auto"/>
-              <w:jc w:val="center"/>
-            </w:pPr>
-            <w:r>
-              <w:rPr>
-                <w:rFonts w:ascii="Aptos" w:hAnsi="Aptos" w:eastAsia="Aptos" w:cs="Aptos"/>
-                <w:b w:val="0"/>
-                <w:color w:val="536176"/>
-                <w:sz w:val="16"/>
-              </w:rPr>
-              <w:t>large capsule • 2 of 2</w:t>
             </w:r>
           </w:p>
           <w:p>
@@ -3055,21 +2722,6 @@
           </w:p>
           <w:p>
             <w:pPr>
-              <w:spacing w:before="0" w:after="40" w:line="228" w:lineRule="auto"/>
-              <w:jc w:val="center"/>
-            </w:pPr>
-            <w:r>
-              <w:rPr>
-                <w:rFonts w:ascii="Aptos" w:hAnsi="Aptos" w:eastAsia="Aptos" w:cs="Aptos"/>
-                <w:b w:val="0"/>
-                <w:color w:val="536176"/>
-                <w:sz w:val="16"/>
-              </w:rPr>
-              <w:t>1pill</w:t>
-            </w:r>
-          </w:p>
-          <w:p>
-            <w:pPr>
               <w:spacing w:before="0" w:after="20" w:line="240" w:lineRule="auto"/>
               <w:jc w:val="center"/>
             </w:pPr>
@@ -3090,15 +2742,6 @@
         <w:spacing w:before="60" w:after="0" w:line="240" w:lineRule="auto"/>
         <w:jc w:val="left"/>
       </w:pPr>
-      <w:r>
-        <w:rPr>
-          <w:rFonts w:ascii="Aptos" w:hAnsi="Aptos" w:eastAsia="Aptos" w:cs="Aptos"/>
-          <w:b w:val="0"/>
-          <w:color w:val="536176"/>
-          <w:sz w:val="14"/>
-        </w:rPr>
-        <w:t xml:space="preserve">One numbered cell = one physical compartment • </w:t>
-      </w:r>
       <w:hyperlink r:id="rId11">
         <w:r>
           <w:rPr>
@@ -3213,7 +2856,7 @@
           <w:color w:val="536176"/>
           <w:sz w:val="16"/>
         </w:rPr>
-        <w:t>Evidence-weighted order continues from Lunch Box 1; each cell is one physical compartment.</w:t>
+        <w:t>Evidence-weighted order continues from Lunch Box 1.</w:t>
       </w:r>
     </w:p>
     <w:tbl>
@@ -3298,21 +2941,6 @@
           </w:p>
           <w:p>
             <w:pPr>
-              <w:spacing w:before="0" w:after="40" w:line="228" w:lineRule="auto"/>
-              <w:jc w:val="center"/>
-            </w:pPr>
-            <w:r>
-              <w:rPr>
-                <w:rFonts w:ascii="Aptos" w:hAnsi="Aptos" w:eastAsia="Aptos" w:cs="Aptos"/>
-                <w:b w:val="0"/>
-                <w:color w:val="536176"/>
-                <w:sz w:val="16"/>
-              </w:rPr>
-              <w:t>1pill</w:t>
-            </w:r>
-          </w:p>
-          <w:p>
-            <w:pPr>
               <w:spacing w:before="0" w:after="20" w:line="240" w:lineRule="auto"/>
               <w:jc w:val="center"/>
             </w:pPr>
@@ -3337,7 +2965,7 @@
                 <w:color w:val="536176"/>
                 <w:sz w:val="15"/>
               </w:rPr>
-              <w:t>Curcuminoids ≥80mg • solid-lipid matrix</w:t>
+              <w:t>Longvida® SLCP™ lipid matrix • Curcuminoids ≥80mg</w:t>
             </w:r>
           </w:p>
         </w:tc>
@@ -3407,21 +3035,6 @@
           </w:p>
           <w:p>
             <w:pPr>
-              <w:spacing w:before="0" w:after="40" w:line="228" w:lineRule="auto"/>
-              <w:jc w:val="center"/>
-            </w:pPr>
-            <w:r>
-              <w:rPr>
-                <w:rFonts w:ascii="Aptos" w:hAnsi="Aptos" w:eastAsia="Aptos" w:cs="Aptos"/>
-                <w:b w:val="0"/>
-                <w:color w:val="536176"/>
-                <w:sz w:val="16"/>
-              </w:rPr>
-              <w:t>1pill</w:t>
-            </w:r>
-          </w:p>
-          <w:p>
-            <w:pPr>
               <w:spacing w:before="0" w:after="20" w:line="240" w:lineRule="auto"/>
               <w:jc w:val="center"/>
             </w:pPr>
@@ -3446,7 +3059,7 @@
                 <w:color w:val="536176"/>
                 <w:sz w:val="15"/>
               </w:rPr>
-              <w:t>Phytoceramides • glycosylceramides • glycolipids</w:t>
+              <w:t>Ceratiq® • phytoceramides • glycosylceramides • glycolipids</w:t>
             </w:r>
           </w:p>
         </w:tc>
@@ -3512,21 +3125,6 @@
                 <w:sz w:val="18"/>
               </w:rPr>
               <w:t>400mg</w:t>
-            </w:r>
-          </w:p>
-          <w:p>
-            <w:pPr>
-              <w:spacing w:before="0" w:after="40" w:line="228" w:lineRule="auto"/>
-              <w:jc w:val="center"/>
-            </w:pPr>
-            <w:r>
-              <w:rPr>
-                <w:rFonts w:ascii="Aptos" w:hAnsi="Aptos" w:eastAsia="Aptos" w:cs="Aptos"/>
-                <w:b w:val="0"/>
-                <w:color w:val="536176"/>
-                <w:sz w:val="16"/>
-              </w:rPr>
-              <w:t>1pill</w:t>
             </w:r>
           </w:p>
           <w:p>
@@ -3630,21 +3228,6 @@
           </w:p>
           <w:p>
             <w:pPr>
-              <w:spacing w:before="0" w:after="40" w:line="228" w:lineRule="auto"/>
-              <w:jc w:val="center"/>
-            </w:pPr>
-            <w:r>
-              <w:rPr>
-                <w:rFonts w:ascii="Aptos" w:hAnsi="Aptos" w:eastAsia="Aptos" w:cs="Aptos"/>
-                <w:b w:val="0"/>
-                <w:color w:val="536176"/>
-                <w:sz w:val="16"/>
-              </w:rPr>
-              <w:t>1pill</w:t>
-            </w:r>
-          </w:p>
-          <w:p>
-            <w:pPr>
               <w:spacing w:before="0" w:after="20" w:line="240" w:lineRule="auto"/>
               <w:jc w:val="center"/>
             </w:pPr>
@@ -3739,21 +3322,6 @@
           </w:p>
           <w:p>
             <w:pPr>
-              <w:spacing w:before="0" w:after="40" w:line="228" w:lineRule="auto"/>
-              <w:jc w:val="center"/>
-            </w:pPr>
-            <w:r>
-              <w:rPr>
-                <w:rFonts w:ascii="Aptos" w:hAnsi="Aptos" w:eastAsia="Aptos" w:cs="Aptos"/>
-                <w:b w:val="0"/>
-                <w:color w:val="536176"/>
-                <w:sz w:val="16"/>
-              </w:rPr>
-              <w:t>1pill</w:t>
-            </w:r>
-          </w:p>
-          <w:p>
-            <w:pPr>
               <w:spacing w:before="0" w:after="20" w:line="240" w:lineRule="auto"/>
               <w:jc w:val="center"/>
             </w:pPr>
@@ -3829,21 +3397,6 @@
                 <w:sz w:val="18"/>
               </w:rPr>
               <w:t>500mg</w:t>
-            </w:r>
-          </w:p>
-          <w:p>
-            <w:pPr>
-              <w:spacing w:before="0" w:after="40" w:line="228" w:lineRule="auto"/>
-              <w:jc w:val="center"/>
-            </w:pPr>
-            <w:r>
-              <w:rPr>
-                <w:rFonts w:ascii="Aptos" w:hAnsi="Aptos" w:eastAsia="Aptos" w:cs="Aptos"/>
-                <w:b w:val="0"/>
-                <w:color w:val="536176"/>
-                <w:sz w:val="16"/>
-              </w:rPr>
-              <w:t>1pill</w:t>
             </w:r>
           </w:p>
           <w:p>
@@ -3947,21 +3500,6 @@
           </w:p>
           <w:p>
             <w:pPr>
-              <w:spacing w:before="0" w:after="40" w:line="228" w:lineRule="auto"/>
-              <w:jc w:val="center"/>
-            </w:pPr>
-            <w:r>
-              <w:rPr>
-                <w:rFonts w:ascii="Aptos" w:hAnsi="Aptos" w:eastAsia="Aptos" w:cs="Aptos"/>
-                <w:b w:val="0"/>
-                <w:color w:val="536176"/>
-                <w:sz w:val="16"/>
-              </w:rPr>
-              <w:t>1pill</w:t>
-            </w:r>
-          </w:p>
-          <w:p>
-            <w:pPr>
               <w:spacing w:before="0" w:after="20" w:line="240" w:lineRule="auto"/>
               <w:jc w:val="center"/>
             </w:pPr>
@@ -4037,21 +3575,6 @@
                 <w:sz w:val="18"/>
               </w:rPr>
               <w:t>380mg</w:t>
-            </w:r>
-          </w:p>
-          <w:p>
-            <w:pPr>
-              <w:spacing w:before="0" w:after="40" w:line="228" w:lineRule="auto"/>
-              <w:jc w:val="center"/>
-            </w:pPr>
-            <w:r>
-              <w:rPr>
-                <w:rFonts w:ascii="Aptos" w:hAnsi="Aptos" w:eastAsia="Aptos" w:cs="Aptos"/>
-                <w:b w:val="0"/>
-                <w:color w:val="536176"/>
-                <w:sz w:val="16"/>
-              </w:rPr>
-              <w:t>1pill</w:t>
             </w:r>
           </w:p>
           <w:p>
@@ -4135,21 +3658,6 @@
           </w:p>
           <w:p>
             <w:pPr>
-              <w:spacing w:before="0" w:after="40" w:line="228" w:lineRule="auto"/>
-              <w:jc w:val="center"/>
-            </w:pPr>
-            <w:r>
-              <w:rPr>
-                <w:rFonts w:ascii="Aptos" w:hAnsi="Aptos" w:eastAsia="Aptos" w:cs="Aptos"/>
-                <w:b w:val="0"/>
-                <w:color w:val="536176"/>
-                <w:sz w:val="16"/>
-              </w:rPr>
-              <w:t>1pill</w:t>
-            </w:r>
-          </w:p>
-          <w:p>
-            <w:pPr>
               <w:spacing w:before="0" w:after="20" w:line="240" w:lineRule="auto"/>
               <w:jc w:val="center"/>
             </w:pPr>
@@ -4170,15 +3678,6 @@
         <w:spacing w:before="60" w:after="0" w:line="240" w:lineRule="auto"/>
         <w:jc w:val="left"/>
       </w:pPr>
-      <w:r>
-        <w:rPr>
-          <w:rFonts w:ascii="Aptos" w:hAnsi="Aptos" w:eastAsia="Aptos" w:cs="Aptos"/>
-          <w:b w:val="0"/>
-          <w:color w:val="536176"/>
-          <w:sz w:val="14"/>
-        </w:rPr>
-        <w:t xml:space="preserve">One numbered cell = one physical compartment • </w:t>
-      </w:r>
       <w:hyperlink r:id="rId11">
         <w:r>
           <w:rPr>
@@ -4293,7 +3792,7 @@
           <w:color w:val="536176"/>
           <w:sz w:val="16"/>
         </w:rPr>
-        <w:t>E.1 is one divided compartment. E.2 remains intentionally empty. Follow the frequency labels exactly.</w:t>
+        <w:t>E.2 remains intentionally empty. Follow the frequency labels exactly.</w:t>
       </w:r>
     </w:p>
     <w:tbl>
@@ -4342,7 +3841,7 @@
                 <w:color w:val="9D2449"/>
                 <w:sz w:val="19"/>
               </w:rPr>
-              <w:t>E.1 • SHARED SLOT</w:t>
+              <w:t>E.1</w:t>
             </w:r>
           </w:p>
           <w:tbl>
@@ -4419,21 +3918,6 @@
                       <w:sz w:val="18"/>
                     </w:rPr>
                     <w:t>10mg</w:t>
-                  </w:r>
-                </w:p>
-                <w:p>
-                  <w:pPr>
-                    <w:spacing w:before="0" w:after="40" w:line="228" w:lineRule="auto"/>
-                    <w:jc w:val="center"/>
-                  </w:pPr>
-                  <w:r>
-                    <w:rPr>
-                      <w:rFonts w:ascii="Aptos" w:hAnsi="Aptos" w:eastAsia="Aptos" w:cs="Aptos"/>
-                      <w:b w:val="0"/>
-                      <w:color w:val="536176"/>
-                      <w:sz w:val="16"/>
-                    </w:rPr>
-                    <w:t>1pill</w:t>
                   </w:r>
                 </w:p>
                 <w:p>
@@ -4528,21 +4012,6 @@
                       <w:sz w:val="18"/>
                     </w:rPr>
                     <w:t>0.5mg</w:t>
-                  </w:r>
-                </w:p>
-                <w:p>
-                  <w:pPr>
-                    <w:spacing w:before="0" w:after="40" w:line="228" w:lineRule="auto"/>
-                    <w:jc w:val="center"/>
-                  </w:pPr>
-                  <w:r>
-                    <w:rPr>
-                      <w:rFonts w:ascii="Aptos" w:hAnsi="Aptos" w:eastAsia="Aptos" w:cs="Aptos"/>
-                      <w:b w:val="0"/>
-                      <w:color w:val="536176"/>
-                      <w:sz w:val="16"/>
-                    </w:rPr>
-                    <w:t>1pill</w:t>
                   </w:r>
                 </w:p>
                 <w:p>
@@ -4710,21 +4179,6 @@
           </w:p>
           <w:p>
             <w:pPr>
-              <w:spacing w:before="0" w:after="40" w:line="228" w:lineRule="auto"/>
-              <w:jc w:val="center"/>
-            </w:pPr>
-            <w:r>
-              <w:rPr>
-                <w:rFonts w:ascii="Aptos" w:hAnsi="Aptos" w:eastAsia="Aptos" w:cs="Aptos"/>
-                <w:b w:val="0"/>
-                <w:color w:val="536176"/>
-                <w:sz w:val="16"/>
-              </w:rPr>
-              <w:t>1pill</w:t>
-            </w:r>
-          </w:p>
-          <w:p>
-            <w:pPr>
               <w:spacing w:before="0" w:after="20" w:line="240" w:lineRule="auto"/>
               <w:jc w:val="center"/>
             </w:pPr>
@@ -4805,21 +4259,6 @@
                 <w:sz w:val="18"/>
               </w:rPr>
               <w:t>200mln CFU</w:t>
-            </w:r>
-          </w:p>
-          <w:p>
-            <w:pPr>
-              <w:spacing w:before="0" w:after="40" w:line="228" w:lineRule="auto"/>
-              <w:jc w:val="center"/>
-            </w:pPr>
-            <w:r>
-              <w:rPr>
-                <w:rFonts w:ascii="Aptos" w:hAnsi="Aptos" w:eastAsia="Aptos" w:cs="Aptos"/>
-                <w:b w:val="0"/>
-                <w:color w:val="536176"/>
-                <w:sz w:val="16"/>
-              </w:rPr>
-              <w:t>1pill</w:t>
             </w:r>
           </w:p>
           <w:p>
@@ -4918,21 +4357,6 @@
           </w:p>
           <w:p>
             <w:pPr>
-              <w:spacing w:before="0" w:after="40" w:line="228" w:lineRule="auto"/>
-              <w:jc w:val="center"/>
-            </w:pPr>
-            <w:r>
-              <w:rPr>
-                <w:rFonts w:ascii="Aptos" w:hAnsi="Aptos" w:eastAsia="Aptos" w:cs="Aptos"/>
-                <w:b w:val="0"/>
-                <w:color w:val="536176"/>
-                <w:sz w:val="16"/>
-              </w:rPr>
-              <w:t>1pill</w:t>
-            </w:r>
-          </w:p>
-          <w:p>
-            <w:pPr>
               <w:spacing w:before="0" w:after="20" w:line="240" w:lineRule="auto"/>
               <w:jc w:val="center"/>
             </w:pPr>
@@ -5027,21 +4451,6 @@
           </w:p>
           <w:p>
             <w:pPr>
-              <w:spacing w:before="0" w:after="40" w:line="228" w:lineRule="auto"/>
-              <w:jc w:val="center"/>
-            </w:pPr>
-            <w:r>
-              <w:rPr>
-                <w:rFonts w:ascii="Aptos" w:hAnsi="Aptos" w:eastAsia="Aptos" w:cs="Aptos"/>
-                <w:b w:val="0"/>
-                <w:color w:val="536176"/>
-                <w:sz w:val="16"/>
-              </w:rPr>
-              <w:t>1pill</w:t>
-            </w:r>
-          </w:p>
-          <w:p>
-            <w:pPr>
               <w:spacing w:before="0" w:after="20" w:line="240" w:lineRule="auto"/>
               <w:jc w:val="center"/>
             </w:pPr>
@@ -5121,7 +4530,7 @@
                 <w:color w:val="162236"/>
                 <w:sz w:val="24"/>
               </w:rPr>
-              <w:t>Glycine</w:t>
+              <w:t>L-Theanine</w:t>
             </w:r>
           </w:p>
           <w:p>
@@ -5136,22 +4545,7 @@
                 <w:color w:val="344E8C"/>
                 <w:sz w:val="18"/>
               </w:rPr>
-              <w:t>1,000mg</w:t>
-            </w:r>
-          </w:p>
-          <w:p>
-            <w:pPr>
-              <w:spacing w:before="0" w:after="40" w:line="228" w:lineRule="auto"/>
-              <w:jc w:val="center"/>
-            </w:pPr>
-            <w:r>
-              <w:rPr>
-                <w:rFonts w:ascii="Aptos" w:hAnsi="Aptos" w:eastAsia="Aptos" w:cs="Aptos"/>
-                <w:b w:val="0"/>
-                <w:color w:val="536176"/>
-                <w:sz w:val="16"/>
-              </w:rPr>
-              <w:t>capsule • 1 of 3</w:t>
+              <w:t>400mg</w:t>
             </w:r>
           </w:p>
           <w:p>
@@ -5165,7 +4559,7 @@
                 <w:b w:val="0"/>
                 <w:sz w:val="20"/>
               </w:rPr>
-              <w:t>😴 🧠</w:t>
+              <w:t>😴 😌 🧠</w:t>
             </w:r>
           </w:p>
         </w:tc>
@@ -5215,7 +4609,7 @@
                 <w:color w:val="162236"/>
                 <w:sz w:val="24"/>
               </w:rPr>
-              <w:t>Glycine</w:t>
+              <w:t>Ashwagandha KSM-66</w:t>
             </w:r>
           </w:p>
           <w:p>
@@ -5230,22 +4624,7 @@
                 <w:color w:val="344E8C"/>
                 <w:sz w:val="18"/>
               </w:rPr>
-              <w:t>1,000mg</w:t>
-            </w:r>
-          </w:p>
-          <w:p>
-            <w:pPr>
-              <w:spacing w:before="0" w:after="40" w:line="228" w:lineRule="auto"/>
-              <w:jc w:val="center"/>
-            </w:pPr>
-            <w:r>
-              <w:rPr>
-                <w:rFonts w:ascii="Aptos" w:hAnsi="Aptos" w:eastAsia="Aptos" w:cs="Aptos"/>
-                <w:b w:val="0"/>
-                <w:color w:val="536176"/>
-                <w:sz w:val="16"/>
-              </w:rPr>
-              <w:t>capsule • 2 of 3</w:t>
+              <w:t>500mg</w:t>
             </w:r>
           </w:p>
           <w:p>
@@ -5259,7 +4638,22 @@
                 <w:b w:val="0"/>
                 <w:sz w:val="20"/>
               </w:rPr>
-              <w:t>😴 🧠</w:t>
+              <w:t>😌 😴</w:t>
+            </w:r>
+          </w:p>
+          <w:p>
+            <w:pPr>
+              <w:spacing w:before="20" w:after="0" w:line="228" w:lineRule="auto"/>
+              <w:jc w:val="center"/>
+            </w:pPr>
+            <w:r>
+              <w:rPr>
+                <w:rFonts w:ascii="Aptos" w:hAnsi="Aptos" w:eastAsia="Aptos" w:cs="Aptos"/>
+                <w:b w:val="0"/>
+                <w:color w:val="536176"/>
+                <w:sz w:val="15"/>
+              </w:rPr>
+              <w:t>Withanolides 25mg</w:t>
             </w:r>
           </w:p>
         </w:tc>
@@ -5329,21 +4723,6 @@
           </w:p>
           <w:p>
             <w:pPr>
-              <w:spacing w:before="0" w:after="40" w:line="228" w:lineRule="auto"/>
-              <w:jc w:val="center"/>
-            </w:pPr>
-            <w:r>
-              <w:rPr>
-                <w:rFonts w:ascii="Aptos" w:hAnsi="Aptos" w:eastAsia="Aptos" w:cs="Aptos"/>
-                <w:b w:val="0"/>
-                <w:color w:val="536176"/>
-                <w:sz w:val="16"/>
-              </w:rPr>
-              <w:t>capsule • 3 of 3</w:t>
-            </w:r>
-          </w:p>
-          <w:p>
-            <w:pPr>
               <w:spacing w:before="0" w:after="20" w:line="240" w:lineRule="auto"/>
               <w:jc w:val="center"/>
             </w:pPr>
@@ -5364,15 +4743,6 @@
         <w:spacing w:before="60" w:after="0" w:line="240" w:lineRule="auto"/>
         <w:jc w:val="left"/>
       </w:pPr>
-      <w:r>
-        <w:rPr>
-          <w:rFonts w:ascii="Aptos" w:hAnsi="Aptos" w:eastAsia="Aptos" w:cs="Aptos"/>
-          <w:b w:val="0"/>
-          <w:color w:val="536176"/>
-          <w:sz w:val="14"/>
-        </w:rPr>
-        <w:t xml:space="preserve">One numbered cell = one physical compartment • </w:t>
-      </w:r>
       <w:hyperlink r:id="rId11">
         <w:r>
           <w:rPr>
@@ -5487,7 +4857,7 @@
           <w:color w:val="536176"/>
           <w:sz w:val="16"/>
         </w:rPr>
-        <w:t>One cell per physical compartment; two Inositol capsules remain separated because of size.</w:t>
+        <w:t>Glycine continues from Evening Box 1.</w:t>
       </w:r>
     </w:p>
     <w:tbl>
@@ -5552,7 +4922,7 @@
                 <w:color w:val="162236"/>
                 <w:sz w:val="24"/>
               </w:rPr>
-              <w:t>L-Theanine</w:t>
+              <w:t>Glycine</w:t>
             </w:r>
           </w:p>
           <w:p>
@@ -5567,22 +4937,7 @@
                 <w:color w:val="344E8C"/>
                 <w:sz w:val="18"/>
               </w:rPr>
-              <w:t>400mg</w:t>
-            </w:r>
-          </w:p>
-          <w:p>
-            <w:pPr>
-              <w:spacing w:before="0" w:after="40" w:line="228" w:lineRule="auto"/>
-              <w:jc w:val="center"/>
-            </w:pPr>
-            <w:r>
-              <w:rPr>
-                <w:rFonts w:ascii="Aptos" w:hAnsi="Aptos" w:eastAsia="Aptos" w:cs="Aptos"/>
-                <w:b w:val="0"/>
-                <w:color w:val="536176"/>
-                <w:sz w:val="16"/>
-              </w:rPr>
-              <w:t>1pill</w:t>
+              <w:t>1,000mg</w:t>
             </w:r>
           </w:p>
           <w:p>
@@ -5596,7 +4951,7 @@
                 <w:b w:val="0"/>
                 <w:sz w:val="20"/>
               </w:rPr>
-              <w:t>😴 😌 🧠</w:t>
+              <w:t>😴 🧠</w:t>
             </w:r>
           </w:p>
         </w:tc>
@@ -5646,7 +5001,7 @@
                 <w:color w:val="162236"/>
                 <w:sz w:val="24"/>
               </w:rPr>
-              <w:t>Berberine HCl</w:t>
+              <w:t>Glycine</w:t>
             </w:r>
           </w:p>
           <w:p>
@@ -5661,22 +5016,7 @@
                 <w:color w:val="344E8C"/>
                 <w:sz w:val="18"/>
               </w:rPr>
-              <w:t>490mg</w:t>
-            </w:r>
-          </w:p>
-          <w:p>
-            <w:pPr>
-              <w:spacing w:before="0" w:after="40" w:line="228" w:lineRule="auto"/>
-              <w:jc w:val="center"/>
-            </w:pPr>
-            <w:r>
-              <w:rPr>
-                <w:rFonts w:ascii="Aptos" w:hAnsi="Aptos" w:eastAsia="Aptos" w:cs="Aptos"/>
-                <w:b w:val="0"/>
-                <w:color w:val="536176"/>
-                <w:sz w:val="16"/>
-              </w:rPr>
-              <w:t>1pill</w:t>
+              <w:t>1,000mg</w:t>
             </w:r>
           </w:p>
           <w:p>
@@ -5690,7 +5030,7 @@
                 <w:b w:val="0"/>
                 <w:sz w:val="20"/>
               </w:rPr>
-              <w:t>🩸 🚽</w:t>
+              <w:t>😴 🧠</w:t>
             </w:r>
           </w:p>
         </w:tc>
@@ -5740,7 +5080,7 @@
                 <w:color w:val="162236"/>
                 <w:sz w:val="24"/>
               </w:rPr>
-              <w:t>Magnesium Glycinate</w:t>
+              <w:t>Berberine HCl</w:t>
             </w:r>
           </w:p>
           <w:p>
@@ -5755,22 +5095,7 @@
                 <w:color w:val="344E8C"/>
                 <w:sz w:val="18"/>
               </w:rPr>
-              <w:t>133.3mg elemental</w:t>
-            </w:r>
-          </w:p>
-          <w:p>
-            <w:pPr>
-              <w:spacing w:before="0" w:after="40" w:line="228" w:lineRule="auto"/>
-              <w:jc w:val="center"/>
-            </w:pPr>
-            <w:r>
-              <w:rPr>
-                <w:rFonts w:ascii="Aptos" w:hAnsi="Aptos" w:eastAsia="Aptos" w:cs="Aptos"/>
-                <w:b w:val="0"/>
-                <w:color w:val="536176"/>
-                <w:sz w:val="16"/>
-              </w:rPr>
-              <w:t>1pill</w:t>
+              <w:t>490mg</w:t>
             </w:r>
           </w:p>
           <w:p>
@@ -5784,7 +5109,7 @@
                 <w:b w:val="0"/>
                 <w:sz w:val="20"/>
               </w:rPr>
-              <w:t>💪 🧠 ❤️ 🦴</w:t>
+              <w:t>🩸 🚽</w:t>
             </w:r>
           </w:p>
         </w:tc>
@@ -5839,7 +5164,7 @@
                 <w:color w:val="162236"/>
                 <w:sz w:val="24"/>
               </w:rPr>
-              <w:t>GABA</w:t>
+              <w:t>Magnesium Glycinate</w:t>
             </w:r>
           </w:p>
           <w:p>
@@ -5854,22 +5179,7 @@
                 <w:color w:val="344E8C"/>
                 <w:sz w:val="18"/>
               </w:rPr>
-              <w:t>250mg</w:t>
-            </w:r>
-          </w:p>
-          <w:p>
-            <w:pPr>
-              <w:spacing w:before="0" w:after="40" w:line="228" w:lineRule="auto"/>
-              <w:jc w:val="center"/>
-            </w:pPr>
-            <w:r>
-              <w:rPr>
-                <w:rFonts w:ascii="Aptos" w:hAnsi="Aptos" w:eastAsia="Aptos" w:cs="Aptos"/>
-                <w:b w:val="0"/>
-                <w:color w:val="536176"/>
-                <w:sz w:val="16"/>
-              </w:rPr>
-              <w:t>1pill</w:t>
+              <w:t>133.3mg elemental</w:t>
             </w:r>
           </w:p>
           <w:p>
@@ -5883,22 +5193,7 @@
                 <w:b w:val="0"/>
                 <w:sz w:val="20"/>
               </w:rPr>
-              <w:t>😴 😌</w:t>
-            </w:r>
-          </w:p>
-          <w:p>
-            <w:pPr>
-              <w:spacing w:before="20" w:after="0" w:line="228" w:lineRule="auto"/>
-              <w:jc w:val="center"/>
-            </w:pPr>
-            <w:r>
-              <w:rPr>
-                <w:rFonts w:ascii="Aptos" w:hAnsi="Aptos" w:eastAsia="Aptos" w:cs="Aptos"/>
-                <w:b w:val="0"/>
-                <w:color w:val="536176"/>
-                <w:sz w:val="15"/>
-              </w:rPr>
-              <w:t>Magnesium citrate 20mg</w:t>
+              <w:t>💪 🧠 ❤️ 🦴</w:t>
             </w:r>
           </w:p>
         </w:tc>
@@ -5968,21 +5263,6 @@
           </w:p>
           <w:p>
             <w:pPr>
-              <w:spacing w:before="0" w:after="40" w:line="228" w:lineRule="auto"/>
-              <w:jc w:val="center"/>
-            </w:pPr>
-            <w:r>
-              <w:rPr>
-                <w:rFonts w:ascii="Aptos" w:hAnsi="Aptos" w:eastAsia="Aptos" w:cs="Aptos"/>
-                <w:b w:val="0"/>
-                <w:color w:val="536176"/>
-                <w:sz w:val="16"/>
-              </w:rPr>
-              <w:t>1pill</w:t>
-            </w:r>
-          </w:p>
-          <w:p>
-            <w:pPr>
               <w:spacing w:before="0" w:after="20" w:line="240" w:lineRule="auto"/>
               <w:jc w:val="center"/>
             </w:pPr>
@@ -6042,7 +5322,7 @@
                 <w:color w:val="162236"/>
                 <w:sz w:val="24"/>
               </w:rPr>
-              <w:t>Ashwagandha Root Extract</w:t>
+              <w:t>GABA</w:t>
             </w:r>
           </w:p>
           <w:p>
@@ -6057,22 +5337,7 @@
                 <w:color w:val="344E8C"/>
                 <w:sz w:val="18"/>
               </w:rPr>
-              <w:t>500mg</w:t>
-            </w:r>
-          </w:p>
-          <w:p>
-            <w:pPr>
-              <w:spacing w:before="0" w:after="40" w:line="228" w:lineRule="auto"/>
-              <w:jc w:val="center"/>
-            </w:pPr>
-            <w:r>
-              <w:rPr>
-                <w:rFonts w:ascii="Aptos" w:hAnsi="Aptos" w:eastAsia="Aptos" w:cs="Aptos"/>
-                <w:b w:val="0"/>
-                <w:color w:val="536176"/>
-                <w:sz w:val="16"/>
-              </w:rPr>
-              <w:t>1pill</w:t>
+              <w:t>250mg</w:t>
             </w:r>
           </w:p>
           <w:p>
@@ -6086,7 +5351,7 @@
                 <w:b w:val="0"/>
                 <w:sz w:val="20"/>
               </w:rPr>
-              <w:t>😌 😴</w:t>
+              <w:t>😴 😌</w:t>
             </w:r>
           </w:p>
           <w:p>
@@ -6101,7 +5366,7 @@
                 <w:color w:val="536176"/>
                 <w:sz w:val="15"/>
               </w:rPr>
-              <w:t>Withanolides 25mg</w:t>
+              <w:t>Magnesium citrate 20mg</w:t>
             </w:r>
           </w:p>
         </w:tc>
@@ -6172,21 +5437,6 @@
                 <w:sz w:val="18"/>
               </w:rPr>
               <w:t>1,000mg</w:t>
-            </w:r>
-          </w:p>
-          <w:p>
-            <w:pPr>
-              <w:spacing w:before="0" w:after="40" w:line="228" w:lineRule="auto"/>
-              <w:jc w:val="center"/>
-            </w:pPr>
-            <w:r>
-              <w:rPr>
-                <w:rFonts w:ascii="Aptos" w:hAnsi="Aptos" w:eastAsia="Aptos" w:cs="Aptos"/>
-                <w:b w:val="0"/>
-                <w:color w:val="536176"/>
-                <w:sz w:val="16"/>
-              </w:rPr>
-              <w:t>capsule • 1 of 2</w:t>
             </w:r>
           </w:p>
           <w:p>
@@ -6270,21 +5520,6 @@
           </w:p>
           <w:p>
             <w:pPr>
-              <w:spacing w:before="0" w:after="40" w:line="228" w:lineRule="auto"/>
-              <w:jc w:val="center"/>
-            </w:pPr>
-            <w:r>
-              <w:rPr>
-                <w:rFonts w:ascii="Aptos" w:hAnsi="Aptos" w:eastAsia="Aptos" w:cs="Aptos"/>
-                <w:b w:val="0"/>
-                <w:color w:val="536176"/>
-                <w:sz w:val="16"/>
-              </w:rPr>
-              <w:t>capsule • 2 of 2</w:t>
-            </w:r>
-          </w:p>
-          <w:p>
-            <w:pPr>
               <w:spacing w:before="0" w:after="20" w:line="240" w:lineRule="auto"/>
               <w:jc w:val="center"/>
             </w:pPr>
@@ -6364,21 +5599,6 @@
           </w:p>
           <w:p>
             <w:pPr>
-              <w:spacing w:before="0" w:after="40" w:line="228" w:lineRule="auto"/>
-              <w:jc w:val="center"/>
-            </w:pPr>
-            <w:r>
-              <w:rPr>
-                <w:rFonts w:ascii="Aptos" w:hAnsi="Aptos" w:eastAsia="Aptos" w:cs="Aptos"/>
-                <w:b w:val="0"/>
-                <w:color w:val="536176"/>
-                <w:sz w:val="16"/>
-              </w:rPr>
-              <w:t>1pill</w:t>
-            </w:r>
-          </w:p>
-          <w:p>
-            <w:pPr>
               <w:spacing w:before="0" w:after="20" w:line="240" w:lineRule="auto"/>
               <w:jc w:val="center"/>
             </w:pPr>
@@ -6399,15 +5619,6 @@
         <w:spacing w:before="60" w:after="0" w:line="240" w:lineRule="auto"/>
         <w:jc w:val="left"/>
       </w:pPr>
-      <w:r>
-        <w:rPr>
-          <w:rFonts w:ascii="Aptos" w:hAnsi="Aptos" w:eastAsia="Aptos" w:cs="Aptos"/>
-          <w:b w:val="0"/>
-          <w:color w:val="536176"/>
-          <w:sz w:val="14"/>
-        </w:rPr>
-        <w:t xml:space="preserve">One numbered cell = one physical compartment • </w:t>
-      </w:r>
       <w:hyperlink r:id="rId11">
         <w:r>
           <w:rPr>
@@ -6587,7 +5798,7 @@
                 <w:color w:val="162236"/>
                 <w:sz w:val="24"/>
               </w:rPr>
-              <w:t>French Maritime Pine-Bark Extract</w:t>
+              <w:t>Pycnogenol</w:t>
             </w:r>
           </w:p>
           <w:p>
@@ -6603,21 +5814,6 @@
                 <w:sz w:val="18"/>
               </w:rPr>
               <w:t>100mg</w:t>
-            </w:r>
-          </w:p>
-          <w:p>
-            <w:pPr>
-              <w:spacing w:before="0" w:after="40" w:line="228" w:lineRule="auto"/>
-              <w:jc w:val="center"/>
-            </w:pPr>
-            <w:r>
-              <w:rPr>
-                <w:rFonts w:ascii="Aptos" w:hAnsi="Aptos" w:eastAsia="Aptos" w:cs="Aptos"/>
-                <w:b w:val="0"/>
-                <w:color w:val="536176"/>
-                <w:sz w:val="16"/>
-              </w:rPr>
-              <w:t>1pill</w:t>
             </w:r>
           </w:p>
           <w:p>
@@ -6646,7 +5842,7 @@
                 <w:color w:val="536176"/>
                 <w:sz w:val="15"/>
               </w:rPr>
-              <w:t>OPC 65mg</w:t>
+              <w:t>French maritime pine • OPC 65mg</w:t>
             </w:r>
           </w:p>
         </w:tc>
@@ -6712,21 +5908,6 @@
                 <w:sz w:val="18"/>
               </w:rPr>
               <w:t>500mg</w:t>
-            </w:r>
-          </w:p>
-          <w:p>
-            <w:pPr>
-              <w:spacing w:before="0" w:after="40" w:line="228" w:lineRule="auto"/>
-              <w:jc w:val="center"/>
-            </w:pPr>
-            <w:r>
-              <w:rPr>
-                <w:rFonts w:ascii="Aptos" w:hAnsi="Aptos" w:eastAsia="Aptos" w:cs="Aptos"/>
-                <w:b w:val="0"/>
-                <w:color w:val="536176"/>
-                <w:sz w:val="16"/>
-              </w:rPr>
-              <w:t>1pill</w:t>
             </w:r>
           </w:p>
           <w:p>
@@ -6825,21 +6006,6 @@
           </w:p>
           <w:p>
             <w:pPr>
-              <w:spacing w:before="0" w:after="40" w:line="228" w:lineRule="auto"/>
-              <w:jc w:val="center"/>
-            </w:pPr>
-            <w:r>
-              <w:rPr>
-                <w:rFonts w:ascii="Aptos" w:hAnsi="Aptos" w:eastAsia="Aptos" w:cs="Aptos"/>
-                <w:b w:val="0"/>
-                <w:color w:val="536176"/>
-                <w:sz w:val="16"/>
-              </w:rPr>
-              <w:t>1pill</w:t>
-            </w:r>
-          </w:p>
-          <w:p>
-            <w:pPr>
               <w:spacing w:before="0" w:after="20" w:line="240" w:lineRule="auto"/>
               <w:jc w:val="center"/>
             </w:pPr>
@@ -6920,21 +6086,6 @@
                 <w:sz w:val="18"/>
               </w:rPr>
               <w:t>500mg</w:t>
-            </w:r>
-          </w:p>
-          <w:p>
-            <w:pPr>
-              <w:spacing w:before="0" w:after="40" w:line="228" w:lineRule="auto"/>
-              <w:jc w:val="center"/>
-            </w:pPr>
-            <w:r>
-              <w:rPr>
-                <w:rFonts w:ascii="Aptos" w:hAnsi="Aptos" w:eastAsia="Aptos" w:cs="Aptos"/>
-                <w:b w:val="0"/>
-                <w:color w:val="536176"/>
-                <w:sz w:val="16"/>
-              </w:rPr>
-              <w:t>1pill</w:t>
             </w:r>
           </w:p>
           <w:p>
@@ -7033,21 +6184,6 @@
           </w:p>
           <w:p>
             <w:pPr>
-              <w:spacing w:before="0" w:after="40" w:line="228" w:lineRule="auto"/>
-              <w:jc w:val="center"/>
-            </w:pPr>
-            <w:r>
-              <w:rPr>
-                <w:rFonts w:ascii="Aptos" w:hAnsi="Aptos" w:eastAsia="Aptos" w:cs="Aptos"/>
-                <w:b w:val="0"/>
-                <w:color w:val="536176"/>
-                <w:sz w:val="16"/>
-              </w:rPr>
-              <w:t>1pill</w:t>
-            </w:r>
-          </w:p>
-          <w:p>
-            <w:pPr>
               <w:spacing w:before="0" w:after="20" w:line="240" w:lineRule="auto"/>
               <w:jc w:val="center"/>
             </w:pPr>
@@ -7107,7 +6243,7 @@
                 <w:color w:val="162236"/>
                 <w:sz w:val="24"/>
               </w:rPr>
-              <w:t>CaAKG</w:t>
+              <w:t>Tribulus Terrestris</w:t>
             </w:r>
           </w:p>
           <w:p>
@@ -7122,22 +6258,7 @@
                 <w:color w:val="8A3FFC"/>
                 <w:sz w:val="18"/>
               </w:rPr>
-              <w:t>500mg</w:t>
-            </w:r>
-          </w:p>
-          <w:p>
-            <w:pPr>
-              <w:spacing w:before="0" w:after="40" w:line="228" w:lineRule="auto"/>
-              <w:jc w:val="center"/>
-            </w:pPr>
-            <w:r>
-              <w:rPr>
-                <w:rFonts w:ascii="Aptos" w:hAnsi="Aptos" w:eastAsia="Aptos" w:cs="Aptos"/>
-                <w:b w:val="0"/>
-                <w:color w:val="536176"/>
-                <w:sz w:val="16"/>
-              </w:rPr>
-              <w:t>capsule • 1 of 3</w:t>
+              <w:t>1,500mg</w:t>
             </w:r>
           </w:p>
           <w:p>
@@ -7151,7 +6272,7 @@
                 <w:b w:val="0"/>
                 <w:sz w:val="20"/>
               </w:rPr>
-              <w:t>⏰ 💪</w:t>
+              <w:t>🍆</w:t>
             </w:r>
           </w:p>
         </w:tc>
@@ -7222,21 +6343,6 @@
                 <w:sz w:val="18"/>
               </w:rPr>
               <w:t>500mg</w:t>
-            </w:r>
-          </w:p>
-          <w:p>
-            <w:pPr>
-              <w:spacing w:before="0" w:after="40" w:line="228" w:lineRule="auto"/>
-              <w:jc w:val="center"/>
-            </w:pPr>
-            <w:r>
-              <w:rPr>
-                <w:rFonts w:ascii="Aptos" w:hAnsi="Aptos" w:eastAsia="Aptos" w:cs="Aptos"/>
-                <w:b w:val="0"/>
-                <w:color w:val="536176"/>
-                <w:sz w:val="16"/>
-              </w:rPr>
-              <w:t>capsule • 2 of 3</w:t>
             </w:r>
           </w:p>
           <w:p>
@@ -7320,21 +6426,6 @@
           </w:p>
           <w:p>
             <w:pPr>
-              <w:spacing w:before="0" w:after="40" w:line="228" w:lineRule="auto"/>
-              <w:jc w:val="center"/>
-            </w:pPr>
-            <w:r>
-              <w:rPr>
-                <w:rFonts w:ascii="Aptos" w:hAnsi="Aptos" w:eastAsia="Aptos" w:cs="Aptos"/>
-                <w:b w:val="0"/>
-                <w:color w:val="536176"/>
-                <w:sz w:val="16"/>
-              </w:rPr>
-              <w:t>capsule • 3 of 3</w:t>
-            </w:r>
-          </w:p>
-          <w:p>
-            <w:pPr>
               <w:spacing w:before="0" w:after="20" w:line="240" w:lineRule="auto"/>
               <w:jc w:val="center"/>
             </w:pPr>
@@ -7394,7 +6485,7 @@
                 <w:color w:val="162236"/>
                 <w:sz w:val="24"/>
               </w:rPr>
-              <w:t>Tribulus Terrestris</w:t>
+              <w:t>CaAKG</w:t>
             </w:r>
           </w:p>
           <w:p>
@@ -7409,22 +6500,7 @@
                 <w:color w:val="8A3FFC"/>
                 <w:sz w:val="18"/>
               </w:rPr>
-              <w:t>1,500mg</w:t>
-            </w:r>
-          </w:p>
-          <w:p>
-            <w:pPr>
-              <w:spacing w:before="0" w:after="40" w:line="228" w:lineRule="auto"/>
-              <w:jc w:val="center"/>
-            </w:pPr>
-            <w:r>
-              <w:rPr>
-                <w:rFonts w:ascii="Aptos" w:hAnsi="Aptos" w:eastAsia="Aptos" w:cs="Aptos"/>
-                <w:b w:val="0"/>
-                <w:color w:val="536176"/>
-                <w:sz w:val="16"/>
-              </w:rPr>
-              <w:t>1pill</w:t>
+              <w:t>500mg</w:t>
             </w:r>
           </w:p>
           <w:p>
@@ -7438,7 +6514,7 @@
                 <w:b w:val="0"/>
                 <w:sz w:val="20"/>
               </w:rPr>
-              <w:t>🍆</w:t>
+              <w:t>⏰ 💪</w:t>
             </w:r>
           </w:p>
         </w:tc>
@@ -7449,15 +6525,6 @@
         <w:spacing w:before="60" w:after="0" w:line="240" w:lineRule="auto"/>
         <w:jc w:val="left"/>
       </w:pPr>
-      <w:r>
-        <w:rPr>
-          <w:rFonts w:ascii="Aptos" w:hAnsi="Aptos" w:eastAsia="Aptos" w:cs="Aptos"/>
-          <w:b w:val="0"/>
-          <w:color w:val="536176"/>
-          <w:sz w:val="14"/>
-        </w:rPr>
-        <w:t xml:space="preserve">One numbered cell = one physical compartment • </w:t>
-      </w:r>
       <w:hyperlink r:id="rId11">
         <w:r>
           <w:rPr>
@@ -7637,7 +6704,7 @@
                 <w:color w:val="162236"/>
                 <w:sz w:val="24"/>
               </w:rPr>
-              <w:t>Undenatured Type II Collagen</w:t>
+              <w:t>UC-II® Type II Collagen</w:t>
             </w:r>
           </w:p>
           <w:p>
@@ -7652,22 +6719,7 @@
                 <w:color w:val="087F5B"/>
                 <w:sz w:val="18"/>
               </w:rPr>
-              <w:t>40mg cartilage complex</w:t>
-            </w:r>
-          </w:p>
-          <w:p>
-            <w:pPr>
-              <w:spacing w:before="0" w:after="40" w:line="228" w:lineRule="auto"/>
-              <w:jc w:val="center"/>
-            </w:pPr>
-            <w:r>
-              <w:rPr>
-                <w:rFonts w:ascii="Aptos" w:hAnsi="Aptos" w:eastAsia="Aptos" w:cs="Aptos"/>
-                <w:b w:val="0"/>
-                <w:color w:val="536176"/>
-                <w:sz w:val="16"/>
-              </w:rPr>
-              <w:t>1pill</w:t>
+              <w:t>40mg</w:t>
             </w:r>
           </w:p>
           <w:p>
@@ -7696,7 +6748,7 @@
                 <w:color w:val="536176"/>
                 <w:sz w:val="15"/>
               </w:rPr>
-              <w:t>Total collagen 10mg</w:t>
+              <w:t>Standardized chicken cartilage • Total collagen 10mg</w:t>
             </w:r>
           </w:p>
         </w:tc>
@@ -7762,21 +6814,6 @@
                 <w:sz w:val="18"/>
               </w:rPr>
               <w:t>500mg</w:t>
-            </w:r>
-          </w:p>
-          <w:p>
-            <w:pPr>
-              <w:spacing w:before="0" w:after="40" w:line="228" w:lineRule="auto"/>
-              <w:jc w:val="center"/>
-            </w:pPr>
-            <w:r>
-              <w:rPr>
-                <w:rFonts w:ascii="Aptos" w:hAnsi="Aptos" w:eastAsia="Aptos" w:cs="Aptos"/>
-                <w:b w:val="0"/>
-                <w:color w:val="536176"/>
-                <w:sz w:val="16"/>
-              </w:rPr>
-              <w:t>1pill</w:t>
             </w:r>
           </w:p>
           <w:p>
@@ -7856,21 +6893,6 @@
                 <w:sz w:val="18"/>
               </w:rPr>
               <w:t>1,500mg</w:t>
-            </w:r>
-          </w:p>
-          <w:p>
-            <w:pPr>
-              <w:spacing w:before="0" w:after="40" w:line="228" w:lineRule="auto"/>
-              <w:jc w:val="center"/>
-            </w:pPr>
-            <w:r>
-              <w:rPr>
-                <w:rFonts w:ascii="Aptos" w:hAnsi="Aptos" w:eastAsia="Aptos" w:cs="Aptos"/>
-                <w:b w:val="0"/>
-                <w:color w:val="536176"/>
-                <w:sz w:val="16"/>
-              </w:rPr>
-              <w:t>tablet • 1 of 2</w:t>
             </w:r>
           </w:p>
           <w:p>
@@ -7955,21 +6977,6 @@
                 <w:sz w:val="18"/>
               </w:rPr>
               <w:t>1,500mg</w:t>
-            </w:r>
-          </w:p>
-          <w:p>
-            <w:pPr>
-              <w:spacing w:before="0" w:after="40" w:line="228" w:lineRule="auto"/>
-              <w:jc w:val="center"/>
-            </w:pPr>
-            <w:r>
-              <w:rPr>
-                <w:rFonts w:ascii="Aptos" w:hAnsi="Aptos" w:eastAsia="Aptos" w:cs="Aptos"/>
-                <w:b w:val="0"/>
-                <w:color w:val="536176"/>
-                <w:sz w:val="16"/>
-              </w:rPr>
-              <w:t>tablet • 2 of 2</w:t>
             </w:r>
           </w:p>
           <w:p>
@@ -8318,21 +7325,6 @@
           </w:p>
           <w:p>
             <w:pPr>
-              <w:spacing w:before="0" w:after="40" w:line="228" w:lineRule="auto"/>
-              <w:jc w:val="center"/>
-            </w:pPr>
-            <w:r>
-              <w:rPr>
-                <w:rFonts w:ascii="Aptos" w:hAnsi="Aptos" w:eastAsia="Aptos" w:cs="Aptos"/>
-                <w:b w:val="0"/>
-                <w:color w:val="536176"/>
-                <w:sz w:val="16"/>
-              </w:rPr>
-              <w:t>1pill</w:t>
-            </w:r>
-          </w:p>
-          <w:p>
-            <w:pPr>
               <w:spacing w:before="0" w:after="20" w:line="240" w:lineRule="auto"/>
               <w:jc w:val="center"/>
             </w:pPr>
@@ -8353,15 +7345,6 @@
         <w:spacing w:before="60" w:after="0" w:line="240" w:lineRule="auto"/>
         <w:jc w:val="left"/>
       </w:pPr>
-      <w:r>
-        <w:rPr>
-          <w:rFonts w:ascii="Aptos" w:hAnsi="Aptos" w:eastAsia="Aptos" w:cs="Aptos"/>
-          <w:b w:val="0"/>
-          <w:color w:val="536176"/>
-          <w:sz w:val="14"/>
-        </w:rPr>
-        <w:t xml:space="preserve">One numbered cell = one physical compartment • </w:t>
-      </w:r>
       <w:hyperlink r:id="rId11">
         <w:r>
           <w:rPr>
@@ -8446,7 +7429,7 @@
         <w:color w:val="536176"/>
         <w:sz w:val="13"/>
       </w:rPr>
-      <w:t>HEALTH PROTOCOL • PHYSICAL SLOT MAP • 22 AUG 2026</w:t>
+      <w:t>HEALTH PROTOCOL • PHYSICAL SLOT MAP • 23 AUG 2026</w:t>
     </w:r>
   </w:p>
 </w:hdr>

</xml_diff>

<commit_message>
fix different names in supplement pillbox guide
</commit_message>
<xml_diff>
--- a/Supplement-Pillbox-Guide.docx
+++ b/Supplement-Pillbox-Guide.docx
@@ -157,7 +157,7 @@
                 <w:color w:val="162236"/>
                 <w:sz w:val="24"/>
               </w:rPr>
-              <w:t>B. longum 35624</w:t>
+              <w:t>Bifidobacterium longum 35624®</w:t>
             </w:r>
           </w:p>
           <w:p>
@@ -236,7 +236,7 @@
                 <w:color w:val="162236"/>
                 <w:sz w:val="24"/>
               </w:rPr>
-              <w:t>L. reuteri Strain Blend</w:t>
+              <w:t>Limosilactobacillus reuteri Gastrus®</w:t>
             </w:r>
           </w:p>
           <w:p>
@@ -280,7 +280,7 @@
                 <w:color w:val="536176"/>
                 <w:sz w:val="15"/>
               </w:rPr>
-              <w:t>DSM 17938 + ATCC PTA 6475</w:t>
+              <w:t>Lactobacillus reuteri DSM 17938 + Lactobacillus reuteri ATCC PTA 6475</w:t>
             </w:r>
           </w:p>
         </w:tc>
@@ -801,7 +801,7 @@
                 <w:color w:val="162236"/>
                 <w:sz w:val="24"/>
               </w:rPr>
-              <w:t>2x Lion’s Mane Fruiting-Body Extract</w:t>
+              <w:t>2x Lion's Mane Fruiting-Body Extract</w:t>
             </w:r>
           </w:p>
           <w:p>
@@ -816,7 +816,7 @@
                 <w:color w:val="176B87"/>
                 <w:sz w:val="18"/>
               </w:rPr>
-              <w:t>500mg each</w:t>
+              <w:t>500mg</w:t>
             </w:r>
           </w:p>
           <w:p>
@@ -845,7 +845,7 @@
                 <w:color w:val="536176"/>
                 <w:sz w:val="15"/>
               </w:rPr>
-              <w:t>Fruiting body • beta-glucans 300mg</w:t>
+              <w:t>Beta-(1,3)(1,6)-Glucans 300mg (30%)</w:t>
             </w:r>
           </w:p>
         </w:tc>
@@ -1144,7 +1144,7 @@
                 <w:color w:val="176B87"/>
                 <w:sz w:val="18"/>
               </w:rPr>
-              <w:t>1,000mg</w:t>
+              <w:t>1g</w:t>
             </w:r>
           </w:p>
           <w:p>
@@ -1357,7 +1357,7 @@
                 <w:color w:val="162236"/>
                 <w:sz w:val="24"/>
               </w:rPr>
-              <w:t>Vitamin K complex</w:t>
+              <w:t>Vitamin K1 + K2 MK-4 + K2 MK-7</w:t>
             </w:r>
           </w:p>
           <w:p>
@@ -1372,9 +1372,9 @@
                 <w:color w:val="176B87"/>
                 <w:sz w:val="18"/>
               </w:rPr>
-              <w:t>K1 1.5mg • MK-4 1mg</w:t>
+              <w:t>K1 1.5mg • K2 MK-4 1mg</w:t>
               <w:br/>
-              <w:t>MK-7 0.2mg</w:t>
+              <w:t>K2 MK-7 0.2mg</w:t>
             </w:r>
           </w:p>
           <w:p>
@@ -1453,7 +1453,7 @@
                 <w:color w:val="176B87"/>
                 <w:sz w:val="18"/>
               </w:rPr>
-              <w:t>300mg each</w:t>
+              <w:t>300mg</w:t>
             </w:r>
           </w:p>
           <w:p>
@@ -1667,7 +1667,7 @@
                 <w:color w:val="176B87"/>
                 <w:sz w:val="18"/>
               </w:rPr>
-              <w:t>50mg</w:t>
+              <w:t>50mg (Spermidine 28mg)</w:t>
             </w:r>
           </w:p>
           <w:p>
@@ -1682,21 +1682,6 @@
                 <w:sz w:val="20"/>
               </w:rPr>
               <w:t>⏰ 🧠</w:t>
-            </w:r>
-          </w:p>
-          <w:p>
-            <w:pPr>
-              <w:spacing w:before="20" w:after="0" w:line="228" w:lineRule="auto"/>
-              <w:jc w:val="center"/>
-            </w:pPr>
-            <w:r>
-              <w:rPr>
-                <w:rFonts w:ascii="Aptos" w:hAnsi="Aptos" w:eastAsia="Aptos" w:cs="Aptos"/>
-                <w:b w:val="0"/>
-                <w:color w:val="536176"/>
-                <w:sz w:val="15"/>
-              </w:rPr>
-              <w:t>Spermidine 28mg</w:t>
             </w:r>
           </w:p>
         </w:tc>
@@ -2093,7 +2078,7 @@
                 <w:color w:val="162236"/>
                 <w:sz w:val="24"/>
               </w:rPr>
-              <w:t>Omega-3</w:t>
+              <w:t>Omega 3</w:t>
             </w:r>
           </w:p>
           <w:p>
@@ -2108,7 +2093,7 @@
                 <w:color w:val="A64B00"/>
                 <w:sz w:val="18"/>
               </w:rPr>
-              <w:t>EPA 500mg • DHA 250mg</w:t>
+              <w:t>500mg EPA • 250mg DHA</w:t>
             </w:r>
           </w:p>
           <w:p>
@@ -2187,7 +2172,7 @@
                 <w:color w:val="162236"/>
                 <w:sz w:val="24"/>
               </w:rPr>
-              <w:t>Omega-3</w:t>
+              <w:t>Omega 3</w:t>
             </w:r>
           </w:p>
           <w:p>
@@ -2202,7 +2187,7 @@
                 <w:color w:val="A64B00"/>
                 <w:sz w:val="18"/>
               </w:rPr>
-              <w:t>EPA 500mg • DHA 250mg</w:t>
+              <w:t>500mg EPA • 250mg DHA</w:t>
             </w:r>
           </w:p>
           <w:p>
@@ -2286,7 +2271,7 @@
                 <w:color w:val="162236"/>
                 <w:sz w:val="24"/>
               </w:rPr>
-              <w:t>Omega-3</w:t>
+              <w:t>Omega 3</w:t>
             </w:r>
           </w:p>
           <w:p>
@@ -2301,7 +2286,7 @@
                 <w:color w:val="A64B00"/>
                 <w:sz w:val="18"/>
               </w:rPr>
-              <w:t>EPA 500mg • DHA 250mg</w:t>
+              <w:t>500mg EPA • 250mg DHA</w:t>
             </w:r>
           </w:p>
           <w:p>
@@ -3015,7 +3000,7 @@
                 <w:color w:val="162236"/>
                 <w:sz w:val="24"/>
               </w:rPr>
-              <w:t>Wheat-Oil Extract</w:t>
+              <w:t>Ceratiq® Wheat Oil Extract</w:t>
             </w:r>
           </w:p>
           <w:p>
@@ -3059,7 +3044,7 @@
                 <w:color w:val="536176"/>
                 <w:sz w:val="15"/>
               </w:rPr>
-              <w:t>Ceratiq® • phytoceramides • glycosylceramides • glycolipids</w:t>
+              <w:t>Phytoceramides • glycosylceramides • glycolipids</w:t>
             </w:r>
           </w:p>
         </w:tc>
@@ -4094,7 +4079,7 @@
                 <w:color w:val="162236"/>
                 <w:sz w:val="24"/>
               </w:rPr>
-              <w:t>Oral Minoxidil</w:t>
+              <w:t>Minoxidil</w:t>
             </w:r>
           </w:p>
           <w:p>
@@ -4173,7 +4158,7 @@
                 <w:color w:val="162236"/>
                 <w:sz w:val="24"/>
               </w:rPr>
-              <w:t>L. reuteri Strain Blend</w:t>
+              <w:t>Limosilactobacillus reuteri Gastrus®</w:t>
             </w:r>
           </w:p>
           <w:p>
@@ -4217,7 +4202,7 @@
                 <w:color w:val="536176"/>
                 <w:sz w:val="15"/>
               </w:rPr>
-              <w:t>DSM 17938 + ATCC PTA 6475</w:t>
+              <w:t>Lactobacillus reuteri DSM 17938 + Lactobacillus reuteri ATCC PTA 6475</w:t>
             </w:r>
           </w:p>
         </w:tc>
@@ -4366,7 +4351,7 @@
                 <w:color w:val="162236"/>
                 <w:sz w:val="24"/>
               </w:rPr>
-              <w:t>Melatonin</w:t>
+              <w:t>Melatonin + Botanical Extract Blend</w:t>
             </w:r>
           </w:p>
           <w:p>
@@ -4410,7 +4395,7 @@
                 <w:color w:val="536176"/>
                 <w:sz w:val="15"/>
               </w:rPr>
-              <w:t>Passionflower • lemon balm • hops • saffron • B6</w:t>
+              <w:t>Passionflower • lemon balm • hops • saffron • Vitamin B6</w:t>
             </w:r>
           </w:p>
         </w:tc>
@@ -5094,7 +5079,7 @@
                 <w:color w:val="162236"/>
                 <w:sz w:val="24"/>
               </w:rPr>
-              <w:t>Magnesium Glycinate</w:t>
+              <w:t>Magnesium (Glycinate)</w:t>
             </w:r>
           </w:p>
           <w:p>
@@ -5109,7 +5094,7 @@
                 <w:color w:val="344E8C"/>
                 <w:sz w:val="18"/>
               </w:rPr>
-              <w:t>133.3mg elemental</w:t>
+              <w:t>133.3mg</w:t>
             </w:r>
           </w:p>
           <w:p>
@@ -5936,7 +5921,7 @@
                 <w:color w:val="536176"/>
                 <w:sz w:val="15"/>
               </w:rPr>
-              <w:t>Rhodiola rosea root • Rosavins 15mg • Salidroside 5mg</w:t>
+              <w:t>Rosavins 15mg (3%) • Salidroside 5mg (1%)</w:t>
             </w:r>
           </w:p>
         </w:tc>
@@ -6001,7 +5986,7 @@
                 <w:color w:val="8A3FFC"/>
                 <w:sz w:val="18"/>
               </w:rPr>
-              <w:t>1,500mg</w:t>
+              <w:t>1.5g</w:t>
             </w:r>
           </w:p>
           <w:p>
@@ -6312,7 +6297,7 @@
                 <w:color w:val="162236"/>
                 <w:sz w:val="24"/>
               </w:rPr>
-              <w:t>CaAKG</w:t>
+              <w:t>Calcium Alpha-Ketoglutarate (CaAKG)</w:t>
             </w:r>
           </w:p>
           <w:p>
@@ -6391,7 +6376,7 @@
                 <w:color w:val="162236"/>
                 <w:sz w:val="24"/>
               </w:rPr>
-              <w:t>CaAKG</w:t>
+              <w:t>Calcium Alpha-Ketoglutarate (CaAKG)</w:t>
             </w:r>
           </w:p>
           <w:p>
@@ -6470,7 +6455,7 @@
                 <w:color w:val="162236"/>
                 <w:sz w:val="24"/>
               </w:rPr>
-              <w:t>CaAKG</w:t>
+              <w:t>Calcium Alpha-Ketoglutarate (CaAKG)</w:t>
             </w:r>
           </w:p>
           <w:p>

</xml_diff>

<commit_message>
replace curcumin and ginger with a better supplement
</commit_message>
<xml_diff>
--- a/Supplement-Pillbox-Guide.docx
+++ b/Supplement-Pillbox-Guide.docx
@@ -2906,7 +2906,7 @@
                 <w:color w:val="162236"/>
                 <w:sz w:val="24"/>
               </w:rPr>
-              <w:t>Curcumin</w:t>
+              <w:t>Curcumin / Ginger / Turmerones Complex</w:t>
             </w:r>
           </w:p>
           <w:p>
@@ -2921,7 +2921,7 @@
                 <w:color w:val="B66B14"/>
                 <w:sz w:val="18"/>
               </w:rPr>
-              <w:t>400mg</w:t>
+              <w:t>Curcuminoids 200mg</w:t>
             </w:r>
           </w:p>
           <w:p>
@@ -2933,9 +2933,9 @@
               <w:rPr>
                 <w:rFonts w:ascii="Segoe UI Emoji" w:hAnsi="Segoe UI Emoji" w:eastAsia="Segoe UI Emoji" w:cs="Segoe UI Emoji"/>
                 <w:b w:val="0"/>
-                <w:sz w:val="20"/>
+                <w:sz w:val="18"/>
               </w:rPr>
-              <w:t>🔥 🧠 🦴</w:t>
+              <w:t>🔥 🧠 🦴 ❤️ 🚽 🍆</w:t>
             </w:r>
           </w:p>
           <w:p>
@@ -2950,7 +2950,7 @@
                 <w:color w:val="536176"/>
                 <w:sz w:val="15"/>
               </w:rPr>
-              <w:t>Longvida® SLCP™ lipid matrix • Curcuminoids ≥80mg</w:t>
+              <w:t>Advanced Curcumin Elite™ • Gingerols 60mg • Turmerones 75mg</w:t>
             </w:r>
           </w:p>
         </w:tc>
@@ -3058,12 +3058,12 @@
               <w:bottom w:w="85" w:type="dxa"/>
               <w:end w:w="115" w:type="dxa"/>
             </w:tcMar>
-            <w:shd w:fill="FFF3DF"/>
+            <w:shd w:fill="EFF3F7"/>
             <w:tcBorders>
-              <w:top w:val="single" w:sz="11" w:color="B66B14"/>
-              <w:left w:val="single" w:sz="11" w:color="B66B14"/>
-              <w:bottom w:val="single" w:sz="11" w:color="B66B14"/>
-              <w:right w:val="single" w:sz="11" w:color="B66B14"/>
+              <w:top w:val="single" w:sz="11" w:color="C9D3DF"/>
+              <w:left w:val="single" w:sz="11" w:color="C9D3DF"/>
+              <w:bottom w:val="single" w:sz="11" w:color="C9D3DF"/>
+              <w:right w:val="single" w:sz="11" w:color="C9D3DF"/>
             </w:tcBorders>
           </w:tcPr>
           <w:p>
@@ -3076,7 +3076,7 @@
               <w:rPr>
                 <w:rFonts w:ascii="Aptos" w:hAnsi="Aptos" w:eastAsia="Aptos" w:cs="Aptos"/>
                 <w:b/>
-                <w:color w:val="B66B14"/>
+                <w:color w:val="7B8797"/>
                 <w:sz w:val="21"/>
               </w:rPr>
               <w:t>L.12</w:t>
@@ -3091,10 +3091,10 @@
               <w:rPr>
                 <w:rFonts w:ascii="Aptos" w:hAnsi="Aptos" w:eastAsia="Aptos" w:cs="Aptos"/>
                 <w:b/>
-                <w:color w:val="162236"/>
-                <w:sz w:val="24"/>
+                <w:color w:val="7B8797"/>
+                <w:sz w:val="30"/>
               </w:rPr>
-              <w:t>Ginger</w:t>
+              <w:t>EMPTY</w:t>
             </w:r>
           </w:p>
           <w:p>
@@ -3105,40 +3105,11 @@
             <w:r>
               <w:rPr>
                 <w:rFonts w:ascii="Aptos" w:hAnsi="Aptos" w:eastAsia="Aptos" w:cs="Aptos"/>
-                <w:b/>
-                <w:color w:val="B66B14"/>
-                <w:sz w:val="18"/>
-              </w:rPr>
-              <w:t>400mg</w:t>
-            </w:r>
-          </w:p>
-          <w:p>
-            <w:pPr>
-              <w:spacing w:before="0" w:after="20" w:line="240" w:lineRule="auto"/>
-              <w:jc w:val="center"/>
-            </w:pPr>
-            <w:r>
-              <w:rPr>
-                <w:rFonts w:ascii="Segoe UI Emoji" w:hAnsi="Segoe UI Emoji" w:eastAsia="Segoe UI Emoji" w:cs="Segoe UI Emoji"/>
-                <w:b w:val="0"/>
-                <w:sz w:val="20"/>
-              </w:rPr>
-              <w:t>🔥 🚽</w:t>
-            </w:r>
-          </w:p>
-          <w:p>
-            <w:pPr>
-              <w:spacing w:before="20" w:after="0" w:line="228" w:lineRule="auto"/>
-              <w:jc w:val="center"/>
-            </w:pPr>
-            <w:r>
-              <w:rPr>
-                <w:rFonts w:ascii="Aptos" w:hAnsi="Aptos" w:eastAsia="Aptos" w:cs="Aptos"/>
                 <w:b w:val="0"/>
                 <w:color w:val="536176"/>
-                <w:sz w:val="15"/>
+                <w:sz w:val="16"/>
               </w:rPr>
-              <w:t>Gingerols 40mg • Shogaols 6.72mg</w:t>
+              <w:t>Available compartment</w:t>
             </w:r>
           </w:p>
         </w:tc>
@@ -7399,7 +7370,7 @@
         <w:color w:val="536176"/>
         <w:sz w:val="13"/>
       </w:rPr>
-      <w:t>HEALTH PROTOCOL • PHYSICAL SLOT MAP • 23 AUG 2026</w:t>
+      <w:t>HEALTH PROTOCOL • PHYSICAL SLOT MAP • 26 AUG 2026</w:t>
     </w:r>
   </w:p>
 </w:hdr>

</xml_diff>

<commit_message>
update supplements links and auto-subscriptions
</commit_message>
<xml_diff>
--- a/Supplement-Pillbox-Guide.docx
+++ b/Supplement-Pillbox-Guide.docx
@@ -523,7 +523,7 @@
                 <w:b w:val="0"/>
                 <w:sz w:val="20"/>
               </w:rPr>
-              <w:t>🧠 ⚡</w:t>
+              <w:t>🧠 ⚡ 🔄</w:t>
             </w:r>
           </w:p>
         </w:tc>
@@ -602,7 +602,7 @@
                 <w:b w:val="0"/>
                 <w:sz w:val="20"/>
               </w:rPr>
-              <w:t>🧠 ⚡</w:t>
+              <w:t>🧠 ⚡ 🔄</w:t>
             </w:r>
           </w:p>
         </w:tc>
@@ -830,7 +830,7 @@
                 <w:b w:val="0"/>
                 <w:sz w:val="20"/>
               </w:rPr>
-              <w:t>🧠 🛡️</w:t>
+              <w:t>🧠 🛡️ 🔄</w:t>
             </w:r>
           </w:p>
           <w:p>
@@ -1064,7 +1064,7 @@
                 <w:b w:val="0"/>
                 <w:sz w:val="20"/>
               </w:rPr>
-              <w:t>🧠 👨‍🦳 🛡️</w:t>
+              <w:t>🧠 👨‍🦳 🛡️ 🔄</w:t>
             </w:r>
           </w:p>
           <w:p>
@@ -1158,7 +1158,7 @@
                 <w:b w:val="0"/>
                 <w:sz w:val="20"/>
               </w:rPr>
-              <w:t>🛡️ 🫁</w:t>
+              <w:t>🛡️ 🫁 🔄</w:t>
             </w:r>
           </w:p>
         </w:tc>
@@ -2906,7 +2906,7 @@
                 <w:color w:val="162236"/>
                 <w:sz w:val="24"/>
               </w:rPr>
-              <w:t>Curcumin / Ginger / Turmerones Complex</w:t>
+              <w:t>Curcumin + Ginger + Turmerones</w:t>
             </w:r>
           </w:p>
           <w:p>
@@ -2935,7 +2935,7 @@
                 <w:b w:val="0"/>
                 <w:sz w:val="18"/>
               </w:rPr>
-              <w:t>🔥 🧠 🦴 ❤️ 🚽 🍆</w:t>
+              <w:t>🔥 🧠 🦴 ❤️ 🚽 🍆 🔄</w:t>
             </w:r>
           </w:p>
           <w:p>
@@ -3029,7 +3029,7 @@
                 <w:b w:val="0"/>
                 <w:sz w:val="20"/>
               </w:rPr>
-              <w:t>👨‍🦳 💧</w:t>
+              <w:t>👨‍🦳 💧 🔄</w:t>
             </w:r>
           </w:p>
           <w:p>
@@ -3366,7 +3366,7 @@
                 <w:b w:val="0"/>
                 <w:sz w:val="20"/>
               </w:rPr>
-              <w:t>❤️ 🛡️</w:t>
+              <w:t>❤️ 🛡️ 🔄</w:t>
             </w:r>
           </w:p>
           <w:p>
@@ -3544,7 +3544,7 @@
                 <w:b w:val="0"/>
                 <w:sz w:val="20"/>
               </w:rPr>
-              <w:t>🛡️ 🚽</w:t>
+              <w:t>🛡️ 🚽 🔄</w:t>
             </w:r>
           </w:p>
         </w:tc>
@@ -3623,7 +3623,7 @@
                 <w:b w:val="0"/>
                 <w:sz w:val="20"/>
               </w:rPr>
-              <w:t>🛡️ 🍆</w:t>
+              <w:t>🛡️ 🍆 🔄</w:t>
             </w:r>
           </w:p>
         </w:tc>
@@ -5163,7 +5163,7 @@
                 <w:b w:val="0"/>
                 <w:sz w:val="20"/>
               </w:rPr>
-              <w:t>🛡️ 🚽</w:t>
+              <w:t>🛡️ 🚽 🔄</w:t>
             </w:r>
           </w:p>
         </w:tc>
@@ -5307,7 +5307,7 @@
                 <w:b w:val="0"/>
                 <w:sz w:val="20"/>
               </w:rPr>
-              <w:t>😴 😌</w:t>
+              <w:t>😴 😌 🔄</w:t>
             </w:r>
           </w:p>
           <w:p>
@@ -6026,7 +6026,7 @@
                 <w:color w:val="162236"/>
                 <w:sz w:val="24"/>
               </w:rPr>
-              <w:t>Maca Root Extract</w:t>
+              <w:t>Raw Maca Root 6:1 Concentrate</w:t>
             </w:r>
           </w:p>
           <w:p>
@@ -6041,7 +6041,7 @@
                 <w:color w:val="8A3FFC"/>
                 <w:sz w:val="18"/>
               </w:rPr>
-              <w:t>500mg</w:t>
+              <w:t>750mg</w:t>
             </w:r>
           </w:p>
           <w:p>
@@ -6055,7 +6055,22 @@
                 <w:b w:val="0"/>
                 <w:sz w:val="20"/>
               </w:rPr>
-              <w:t>🍆 ⚡</w:t>
+              <w:t>🍆 ⚡ 🔄</w:t>
+            </w:r>
+          </w:p>
+          <w:p>
+            <w:pPr>
+              <w:spacing w:before="20" w:after="0" w:line="228" w:lineRule="auto"/>
+              <w:jc w:val="center"/>
+            </w:pPr>
+            <w:r>
+              <w:rPr>
+                <w:rFonts w:ascii="Aptos" w:hAnsi="Aptos" w:eastAsia="Aptos" w:cs="Aptos"/>
+                <w:b w:val="0"/>
+                <w:color w:val="536176"/>
+                <w:sz w:val="15"/>
+              </w:rPr>
+              <w:t>Gelatinized • 4.5g fresh-root equivalent</w:t>
             </w:r>
           </w:p>
         </w:tc>
@@ -6674,7 +6689,7 @@
                 <w:b w:val="0"/>
                 <w:sz w:val="20"/>
               </w:rPr>
-              <w:t>🦴 💪</w:t>
+              <w:t>🦴 💪 🔄</w:t>
             </w:r>
           </w:p>
           <w:p>
@@ -6818,7 +6833,7 @@
                 <w:color w:val="162236"/>
                 <w:sz w:val="24"/>
               </w:rPr>
-              <w:t>MSM</w:t>
+              <w:t>MSM (OptiMSM®)</w:t>
             </w:r>
           </w:p>
           <w:p>
@@ -6847,7 +6862,7 @@
                 <w:b w:val="0"/>
                 <w:sz w:val="20"/>
               </w:rPr>
-              <w:t>🦴 🔥 👨‍🦳</w:t>
+              <w:t>🦴 🔥 👨‍🦳 🔄</w:t>
             </w:r>
           </w:p>
         </w:tc>
@@ -6902,7 +6917,7 @@
                 <w:color w:val="162236"/>
                 <w:sz w:val="24"/>
               </w:rPr>
-              <w:t>MSM</w:t>
+              <w:t>MSM (OptiMSM®)</w:t>
             </w:r>
           </w:p>
           <w:p>
@@ -6931,7 +6946,7 @@
                 <w:b w:val="0"/>
                 <w:sz w:val="20"/>
               </w:rPr>
-              <w:t>🦴 🔥 👨‍🦳</w:t>
+              <w:t>🦴 🔥 👨‍🦳 🔄</w:t>
             </w:r>
           </w:p>
         </w:tc>

</xml_diff>

<commit_message>
Optimize supplement stack and add evidence tiers
</commit_message>
<xml_diff>
--- a/Supplement-Pillbox-Guide.docx
+++ b/Supplement-Pillbox-Guide.docx
@@ -137,6 +137,15 @@
             <w:r/>
             <w:r>
               <w:rPr>
+                <w:rFonts w:ascii="Segoe UI Emoji" w:hAnsi="Segoe UI Emoji" w:eastAsia="Segoe UI Emoji" w:cs="Segoe UI Emoji"/>
+                <w:b/>
+                <w:color w:val="176B87"/>
+                <w:sz w:val="21"/>
+              </w:rPr>
+              <w:t xml:space="preserve">🥇 </w:t>
+            </w:r>
+            <w:r>
+              <w:rPr>
                 <w:rFonts w:ascii="Aptos" w:hAnsi="Aptos" w:eastAsia="Aptos" w:cs="Aptos"/>
                 <w:b/>
                 <w:color w:val="176B87"/>
@@ -214,6 +223,15 @@
               <w:jc w:val="left"/>
             </w:pPr>
             <w:r/>
+            <w:r>
+              <w:rPr>
+                <w:rFonts w:ascii="Segoe UI Emoji" w:hAnsi="Segoe UI Emoji" w:eastAsia="Segoe UI Emoji" w:cs="Segoe UI Emoji"/>
+                <w:b/>
+                <w:color w:val="176B87"/>
+                <w:sz w:val="21"/>
+              </w:rPr>
+              <w:t xml:space="preserve">🥈 </w:t>
+            </w:r>
             <w:r>
               <w:rPr>
                 <w:rFonts w:ascii="Aptos" w:hAnsi="Aptos" w:eastAsia="Aptos" w:cs="Aptos"/>
@@ -380,6 +398,15 @@
             <w:r/>
             <w:r>
               <w:rPr>
+                <w:rFonts w:ascii="Segoe UI Emoji" w:hAnsi="Segoe UI Emoji" w:eastAsia="Segoe UI Emoji" w:cs="Segoe UI Emoji"/>
+                <w:b/>
+                <w:color w:val="176B87"/>
+                <w:sz w:val="21"/>
+              </w:rPr>
+              <w:t xml:space="preserve">🥈 </w:t>
+            </w:r>
+            <w:r>
+              <w:rPr>
                 <w:rFonts w:ascii="Aptos" w:hAnsi="Aptos" w:eastAsia="Aptos" w:cs="Aptos"/>
                 <w:b/>
                 <w:color w:val="176B87"/>
@@ -474,6 +501,15 @@
             <w:r/>
             <w:r>
               <w:rPr>
+                <w:rFonts w:ascii="Segoe UI Emoji" w:hAnsi="Segoe UI Emoji" w:eastAsia="Segoe UI Emoji" w:cs="Segoe UI Emoji"/>
+                <w:b/>
+                <w:color w:val="176B87"/>
+                <w:sz w:val="21"/>
+              </w:rPr>
+              <w:t xml:space="preserve">🥈 </w:t>
+            </w:r>
+            <w:r>
+              <w:rPr>
                 <w:rFonts w:ascii="Aptos" w:hAnsi="Aptos" w:eastAsia="Aptos" w:cs="Aptos"/>
                 <w:b/>
                 <w:color w:val="176B87"/>
@@ -551,6 +587,15 @@
               <w:jc w:val="left"/>
             </w:pPr>
             <w:r/>
+            <w:r>
+              <w:rPr>
+                <w:rFonts w:ascii="Segoe UI Emoji" w:hAnsi="Segoe UI Emoji" w:eastAsia="Segoe UI Emoji" w:cs="Segoe UI Emoji"/>
+                <w:b/>
+                <w:color w:val="176B87"/>
+                <w:sz w:val="21"/>
+              </w:rPr>
+              <w:t xml:space="preserve">🥈 </w:t>
+            </w:r>
             <w:r>
               <w:rPr>
                 <w:rFonts w:ascii="Aptos" w:hAnsi="Aptos" w:eastAsia="Aptos" w:cs="Aptos"/>
@@ -702,6 +747,15 @@
             <w:r/>
             <w:r>
               <w:rPr>
+                <w:rFonts w:ascii="Segoe UI Emoji" w:hAnsi="Segoe UI Emoji" w:eastAsia="Segoe UI Emoji" w:cs="Segoe UI Emoji"/>
+                <w:b/>
+                <w:color w:val="176B87"/>
+                <w:sz w:val="21"/>
+              </w:rPr>
+              <w:t xml:space="preserve">🥈 </w:t>
+            </w:r>
+            <w:r>
+              <w:rPr>
                 <w:rFonts w:ascii="Aptos" w:hAnsi="Aptos" w:eastAsia="Aptos" w:cs="Aptos"/>
                 <w:b/>
                 <w:color w:val="176B87"/>
@@ -781,6 +835,15 @@
             <w:r/>
             <w:r>
               <w:rPr>
+                <w:rFonts w:ascii="Segoe UI Emoji" w:hAnsi="Segoe UI Emoji" w:eastAsia="Segoe UI Emoji" w:cs="Segoe UI Emoji"/>
+                <w:b/>
+                <w:color w:val="176B87"/>
+                <w:sz w:val="21"/>
+              </w:rPr>
+              <w:t xml:space="preserve">🥈 </w:t>
+            </w:r>
+            <w:r>
+              <w:rPr>
                 <w:rFonts w:ascii="Aptos" w:hAnsi="Aptos" w:eastAsia="Aptos" w:cs="Aptos"/>
                 <w:b/>
                 <w:color w:val="176B87"/>
@@ -873,6 +936,15 @@
           <w:sz w:val="14"/>
         </w:rPr>
         <w:t xml:space="preserve"> • Full doses and evidence notes: README.md</w:t>
+      </w:r>
+      <w:r>
+        <w:rPr>
+          <w:rFonts w:ascii="Segoe UI Emoji" w:hAnsi="Segoe UI Emoji" w:eastAsia="Segoe UI Emoji" w:cs="Segoe UI Emoji"/>
+          <w:b w:val="0"/>
+          <w:color w:val="536176"/>
+          <w:sz w:val="13"/>
+        </w:rPr>
+        <w:t xml:space="preserve"> • 🥇 strongest • 🥈 supportive • 🥉 exploratory</w:t>
       </w:r>
     </w:p>
     <w:p>
@@ -1015,6 +1087,15 @@
             <w:r/>
             <w:r>
               <w:rPr>
+                <w:rFonts w:ascii="Segoe UI Emoji" w:hAnsi="Segoe UI Emoji" w:eastAsia="Segoe UI Emoji" w:cs="Segoe UI Emoji"/>
+                <w:b/>
+                <w:color w:val="176B87"/>
+                <w:sz w:val="21"/>
+              </w:rPr>
+              <w:t xml:space="preserve">🥉 </w:t>
+            </w:r>
+            <w:r>
+              <w:rPr>
                 <w:rFonts w:ascii="Aptos" w:hAnsi="Aptos" w:eastAsia="Aptos" w:cs="Aptos"/>
                 <w:b/>
                 <w:color w:val="176B87"/>
@@ -1107,6 +1188,15 @@
               <w:jc w:val="left"/>
             </w:pPr>
             <w:r/>
+            <w:r>
+              <w:rPr>
+                <w:rFonts w:ascii="Segoe UI Emoji" w:hAnsi="Segoe UI Emoji" w:eastAsia="Segoe UI Emoji" w:cs="Segoe UI Emoji"/>
+                <w:b/>
+                <w:color w:val="176B87"/>
+                <w:sz w:val="21"/>
+              </w:rPr>
+              <w:t xml:space="preserve">🥈 </w:t>
+            </w:r>
             <w:r>
               <w:rPr>
                 <w:rFonts w:ascii="Aptos" w:hAnsi="Aptos" w:eastAsia="Aptos" w:cs="Aptos"/>
@@ -1258,6 +1348,15 @@
             <w:r/>
             <w:r>
               <w:rPr>
+                <w:rFonts w:ascii="Segoe UI Emoji" w:hAnsi="Segoe UI Emoji" w:eastAsia="Segoe UI Emoji" w:cs="Segoe UI Emoji"/>
+                <w:b/>
+                <w:color w:val="176B87"/>
+                <w:sz w:val="21"/>
+              </w:rPr>
+              <w:t xml:space="preserve">🥈 </w:t>
+            </w:r>
+            <w:r>
+              <w:rPr>
                 <w:rFonts w:ascii="Aptos" w:hAnsi="Aptos" w:eastAsia="Aptos" w:cs="Aptos"/>
                 <w:b/>
                 <w:color w:val="176B87"/>
@@ -1337,6 +1436,15 @@
             <w:r/>
             <w:r>
               <w:rPr>
+                <w:rFonts w:ascii="Segoe UI Emoji" w:hAnsi="Segoe UI Emoji" w:eastAsia="Segoe UI Emoji" w:cs="Segoe UI Emoji"/>
+                <w:b/>
+                <w:color w:val="176B87"/>
+                <w:sz w:val="21"/>
+              </w:rPr>
+              <w:t xml:space="preserve">🥉 </w:t>
+            </w:r>
+            <w:r>
+              <w:rPr>
                 <w:rFonts w:ascii="Aptos" w:hAnsi="Aptos" w:eastAsia="Aptos" w:cs="Aptos"/>
                 <w:b/>
                 <w:color w:val="176B87"/>
@@ -1416,6 +1524,15 @@
               <w:jc w:val="left"/>
             </w:pPr>
             <w:r/>
+            <w:r>
+              <w:rPr>
+                <w:rFonts w:ascii="Segoe UI Emoji" w:hAnsi="Segoe UI Emoji" w:eastAsia="Segoe UI Emoji" w:cs="Segoe UI Emoji"/>
+                <w:b/>
+                <w:color w:val="176B87"/>
+                <w:sz w:val="21"/>
+              </w:rPr>
+              <w:t xml:space="preserve">🥉 </w:t>
+            </w:r>
             <w:r>
               <w:rPr>
                 <w:rFonts w:ascii="Aptos" w:hAnsi="Aptos" w:eastAsia="Aptos" w:cs="Aptos"/>
@@ -1632,6 +1749,15 @@
             <w:r/>
             <w:r>
               <w:rPr>
+                <w:rFonts w:ascii="Segoe UI Emoji" w:hAnsi="Segoe UI Emoji" w:eastAsia="Segoe UI Emoji" w:cs="Segoe UI Emoji"/>
+                <w:b/>
+                <w:color w:val="176B87"/>
+                <w:sz w:val="21"/>
+              </w:rPr>
+              <w:t xml:space="preserve">🥉 </w:t>
+            </w:r>
+            <w:r>
+              <w:rPr>
                 <w:rFonts w:ascii="Aptos" w:hAnsi="Aptos" w:eastAsia="Aptos" w:cs="Aptos"/>
                 <w:b/>
                 <w:color w:val="176B87"/>
@@ -1709,6 +1835,15 @@
           <w:sz w:val="14"/>
         </w:rPr>
         <w:t xml:space="preserve"> • Full doses and evidence notes: README.md</w:t>
+      </w:r>
+      <w:r>
+        <w:rPr>
+          <w:rFonts w:ascii="Segoe UI Emoji" w:hAnsi="Segoe UI Emoji" w:eastAsia="Segoe UI Emoji" w:cs="Segoe UI Emoji"/>
+          <w:b w:val="0"/>
+          <w:color w:val="536176"/>
+          <w:sz w:val="13"/>
+        </w:rPr>
+        <w:t xml:space="preserve"> • 🥇 strongest • 🥈 supportive • 🥉 exploratory</w:t>
       </w:r>
     </w:p>
     <w:p>
@@ -2058,6 +2193,15 @@
             <w:r/>
             <w:r>
               <w:rPr>
+                <w:rFonts w:ascii="Segoe UI Emoji" w:hAnsi="Segoe UI Emoji" w:eastAsia="Segoe UI Emoji" w:cs="Segoe UI Emoji"/>
+                <w:b/>
+                <w:color w:val="A64B00"/>
+                <w:sz w:val="21"/>
+              </w:rPr>
+              <w:t xml:space="preserve">🥇 </w:t>
+            </w:r>
+            <w:r>
+              <w:rPr>
                 <w:rFonts w:ascii="Aptos" w:hAnsi="Aptos" w:eastAsia="Aptos" w:cs="Aptos"/>
                 <w:b/>
                 <w:color w:val="A64B00"/>
@@ -2150,6 +2294,15 @@
               <w:jc w:val="left"/>
             </w:pPr>
             <w:r/>
+            <w:r>
+              <w:rPr>
+                <w:rFonts w:ascii="Segoe UI Emoji" w:hAnsi="Segoe UI Emoji" w:eastAsia="Segoe UI Emoji" w:cs="Segoe UI Emoji"/>
+                <w:b/>
+                <w:color w:val="A64B00"/>
+                <w:sz w:val="21"/>
+              </w:rPr>
+              <w:t xml:space="preserve">🥇 </w:t>
+            </w:r>
             <w:r>
               <w:rPr>
                 <w:rFonts w:ascii="Aptos" w:hAnsi="Aptos" w:eastAsia="Aptos" w:cs="Aptos"/>
@@ -2251,6 +2404,15 @@
             <w:r/>
             <w:r>
               <w:rPr>
+                <w:rFonts w:ascii="Segoe UI Emoji" w:hAnsi="Segoe UI Emoji" w:eastAsia="Segoe UI Emoji" w:cs="Segoe UI Emoji"/>
+                <w:b/>
+                <w:color w:val="A64B00"/>
+                <w:sz w:val="21"/>
+              </w:rPr>
+              <w:t xml:space="preserve">🥇 </w:t>
+            </w:r>
+            <w:r>
+              <w:rPr>
                 <w:rFonts w:ascii="Aptos" w:hAnsi="Aptos" w:eastAsia="Aptos" w:cs="Aptos"/>
                 <w:b/>
                 <w:color w:val="A64B00"/>
@@ -2345,6 +2507,15 @@
             <w:r/>
             <w:r>
               <w:rPr>
+                <w:rFonts w:ascii="Segoe UI Emoji" w:hAnsi="Segoe UI Emoji" w:eastAsia="Segoe UI Emoji" w:cs="Segoe UI Emoji"/>
+                <w:b/>
+                <w:color w:val="B66B14"/>
+                <w:sz w:val="21"/>
+              </w:rPr>
+              <w:t xml:space="preserve">🥈 </w:t>
+            </w:r>
+            <w:r>
+              <w:rPr>
                 <w:rFonts w:ascii="Aptos" w:hAnsi="Aptos" w:eastAsia="Aptos" w:cs="Aptos"/>
                 <w:b/>
                 <w:color w:val="B66B14"/>
@@ -2437,6 +2608,15 @@
               <w:jc w:val="left"/>
             </w:pPr>
             <w:r/>
+            <w:r>
+              <w:rPr>
+                <w:rFonts w:ascii="Segoe UI Emoji" w:hAnsi="Segoe UI Emoji" w:eastAsia="Segoe UI Emoji" w:cs="Segoe UI Emoji"/>
+                <w:b/>
+                <w:color w:val="B66B14"/>
+                <w:sz w:val="21"/>
+              </w:rPr>
+              <w:t xml:space="preserve">🥈 </w:t>
+            </w:r>
             <w:r>
               <w:rPr>
                 <w:rFonts w:ascii="Aptos" w:hAnsi="Aptos" w:eastAsia="Aptos" w:cs="Aptos"/>
@@ -2523,6 +2703,15 @@
             <w:r/>
             <w:r>
               <w:rPr>
+                <w:rFonts w:ascii="Segoe UI Emoji" w:hAnsi="Segoe UI Emoji" w:eastAsia="Segoe UI Emoji" w:cs="Segoe UI Emoji"/>
+                <w:b/>
+                <w:color w:val="B66B14"/>
+                <w:sz w:val="21"/>
+              </w:rPr>
+              <w:t xml:space="preserve">🥈 </w:t>
+            </w:r>
+            <w:r>
+              <w:rPr>
                 <w:rFonts w:ascii="Aptos" w:hAnsi="Aptos" w:eastAsia="Aptos" w:cs="Aptos"/>
                 <w:b/>
                 <w:color w:val="B66B14"/>
@@ -2667,6 +2856,15 @@
             <w:r/>
             <w:r>
               <w:rPr>
+                <w:rFonts w:ascii="Segoe UI Emoji" w:hAnsi="Segoe UI Emoji" w:eastAsia="Segoe UI Emoji" w:cs="Segoe UI Emoji"/>
+                <w:b/>
+                <w:color w:val="B66B14"/>
+                <w:sz w:val="21"/>
+              </w:rPr>
+              <w:t xml:space="preserve">🥈 </w:t>
+            </w:r>
+            <w:r>
+              <w:rPr>
                 <w:rFonts w:ascii="Aptos" w:hAnsi="Aptos" w:eastAsia="Aptos" w:cs="Aptos"/>
                 <w:b/>
                 <w:color w:val="B66B14"/>
@@ -2744,6 +2942,15 @@
           <w:sz w:val="14"/>
         </w:rPr>
         <w:t xml:space="preserve"> • Full doses and evidence notes: README.md</w:t>
+      </w:r>
+      <w:r>
+        <w:rPr>
+          <w:rFonts w:ascii="Segoe UI Emoji" w:hAnsi="Segoe UI Emoji" w:eastAsia="Segoe UI Emoji" w:cs="Segoe UI Emoji"/>
+          <w:b w:val="0"/>
+          <w:color w:val="536176"/>
+          <w:sz w:val="13"/>
+        </w:rPr>
+        <w:t xml:space="preserve"> • 🥇 strongest • 🥈 supportive • 🥉 exploratory</w:t>
       </w:r>
     </w:p>
     <w:p>
@@ -2886,6 +3093,15 @@
             <w:r/>
             <w:r>
               <w:rPr>
+                <w:rFonts w:ascii="Segoe UI Emoji" w:hAnsi="Segoe UI Emoji" w:eastAsia="Segoe UI Emoji" w:cs="Segoe UI Emoji"/>
+                <w:b/>
+                <w:color w:val="B66B14"/>
+                <w:sz w:val="21"/>
+              </w:rPr>
+              <w:t xml:space="preserve">🥈 </w:t>
+            </w:r>
+            <w:r>
+              <w:rPr>
                 <w:rFonts w:ascii="Aptos" w:hAnsi="Aptos" w:eastAsia="Aptos" w:cs="Aptos"/>
                 <w:b/>
                 <w:color w:val="B66B14"/>
@@ -2978,6 +3194,15 @@
               <w:jc w:val="left"/>
             </w:pPr>
             <w:r/>
+            <w:r>
+              <w:rPr>
+                <w:rFonts w:ascii="Segoe UI Emoji" w:hAnsi="Segoe UI Emoji" w:eastAsia="Segoe UI Emoji" w:cs="Segoe UI Emoji"/>
+                <w:b/>
+                <w:color w:val="B66B14"/>
+                <w:sz w:val="21"/>
+              </w:rPr>
+              <w:t xml:space="preserve">🥈 </w:t>
+            </w:r>
             <w:r>
               <w:rPr>
                 <w:rFonts w:ascii="Aptos" w:hAnsi="Aptos" w:eastAsia="Aptos" w:cs="Aptos"/>
@@ -3144,6 +3369,15 @@
             <w:r/>
             <w:r>
               <w:rPr>
+                <w:rFonts w:ascii="Segoe UI Emoji" w:hAnsi="Segoe UI Emoji" w:eastAsia="Segoe UI Emoji" w:cs="Segoe UI Emoji"/>
+                <w:b/>
+                <w:color w:val="B66B14"/>
+                <w:sz w:val="21"/>
+              </w:rPr>
+              <w:t xml:space="preserve">🥉 </w:t>
+            </w:r>
+            <w:r>
+              <w:rPr>
                 <w:rFonts w:ascii="Aptos" w:hAnsi="Aptos" w:eastAsia="Aptos" w:cs="Aptos"/>
                 <w:b/>
                 <w:color w:val="B66B14"/>
@@ -3238,6 +3472,15 @@
             <w:r/>
             <w:r>
               <w:rPr>
+                <w:rFonts w:ascii="Segoe UI Emoji" w:hAnsi="Segoe UI Emoji" w:eastAsia="Segoe UI Emoji" w:cs="Segoe UI Emoji"/>
+                <w:b/>
+                <w:color w:val="B66B14"/>
+                <w:sz w:val="21"/>
+              </w:rPr>
+              <w:t xml:space="preserve">🥈 </w:t>
+            </w:r>
+            <w:r>
+              <w:rPr>
                 <w:rFonts w:ascii="Aptos" w:hAnsi="Aptos" w:eastAsia="Aptos" w:cs="Aptos"/>
                 <w:b/>
                 <w:color w:val="B66B14"/>
@@ -3315,6 +3558,15 @@
               <w:jc w:val="left"/>
             </w:pPr>
             <w:r/>
+            <w:r>
+              <w:rPr>
+                <w:rFonts w:ascii="Segoe UI Emoji" w:hAnsi="Segoe UI Emoji" w:eastAsia="Segoe UI Emoji" w:cs="Segoe UI Emoji"/>
+                <w:b/>
+                <w:color w:val="B66B14"/>
+                <w:sz w:val="21"/>
+              </w:rPr>
+              <w:t xml:space="preserve">🥈 </w:t>
+            </w:r>
             <w:r>
               <w:rPr>
                 <w:rFonts w:ascii="Aptos" w:hAnsi="Aptos" w:eastAsia="Aptos" w:cs="Aptos"/>
@@ -3416,6 +3668,15 @@
             <w:r/>
             <w:r>
               <w:rPr>
+                <w:rFonts w:ascii="Segoe UI Emoji" w:hAnsi="Segoe UI Emoji" w:eastAsia="Segoe UI Emoji" w:cs="Segoe UI Emoji"/>
+                <w:b/>
+                <w:color w:val="B66B14"/>
+                <w:sz w:val="21"/>
+              </w:rPr>
+              <w:t xml:space="preserve">🥈 </w:t>
+            </w:r>
+            <w:r>
+              <w:rPr>
                 <w:rFonts w:ascii="Aptos" w:hAnsi="Aptos" w:eastAsia="Aptos" w:cs="Aptos"/>
                 <w:b/>
                 <w:color w:val="B66B14"/>
@@ -3495,6 +3756,15 @@
             <w:r/>
             <w:r>
               <w:rPr>
+                <w:rFonts w:ascii="Segoe UI Emoji" w:hAnsi="Segoe UI Emoji" w:eastAsia="Segoe UI Emoji" w:cs="Segoe UI Emoji"/>
+                <w:b/>
+                <w:color w:val="B66B14"/>
+                <w:sz w:val="21"/>
+              </w:rPr>
+              <w:t xml:space="preserve">🥈 </w:t>
+            </w:r>
+            <w:r>
+              <w:rPr>
                 <w:rFonts w:ascii="Aptos" w:hAnsi="Aptos" w:eastAsia="Aptos" w:cs="Aptos"/>
                 <w:b/>
                 <w:color w:val="B66B14"/>
@@ -3574,6 +3844,15 @@
             <w:r/>
             <w:r>
               <w:rPr>
+                <w:rFonts w:ascii="Segoe UI Emoji" w:hAnsi="Segoe UI Emoji" w:eastAsia="Segoe UI Emoji" w:cs="Segoe UI Emoji"/>
+                <w:b/>
+                <w:color w:val="B66B14"/>
+                <w:sz w:val="21"/>
+              </w:rPr>
+              <w:t xml:space="preserve">🥉 </w:t>
+            </w:r>
+            <w:r>
+              <w:rPr>
                 <w:rFonts w:ascii="Aptos" w:hAnsi="Aptos" w:eastAsia="Aptos" w:cs="Aptos"/>
                 <w:b/>
                 <w:color w:val="B66B14"/>
@@ -3651,6 +3930,15 @@
           <w:sz w:val="14"/>
         </w:rPr>
         <w:t xml:space="preserve"> • Full doses and evidence notes: README.md</w:t>
+      </w:r>
+      <w:r>
+        <w:rPr>
+          <w:rFonts w:ascii="Segoe UI Emoji" w:hAnsi="Segoe UI Emoji" w:eastAsia="Segoe UI Emoji" w:cs="Segoe UI Emoji"/>
+          <w:b w:val="0"/>
+          <w:color w:val="536176"/>
+          <w:sz w:val="13"/>
+        </w:rPr>
+        <w:t xml:space="preserve"> • 🥇 strongest • 🥈 supportive • 🥉 exploratory</w:t>
       </w:r>
     </w:p>
     <w:p>
@@ -4109,6 +4397,15 @@
             <w:r/>
             <w:r>
               <w:rPr>
+                <w:rFonts w:ascii="Segoe UI Emoji" w:hAnsi="Segoe UI Emoji" w:eastAsia="Segoe UI Emoji" w:cs="Segoe UI Emoji"/>
+                <w:b/>
+                <w:color w:val="344E8C"/>
+                <w:sz w:val="21"/>
+              </w:rPr>
+              <w:t xml:space="preserve">🥈 </w:t>
+            </w:r>
+            <w:r>
+              <w:rPr>
                 <w:rFonts w:ascii="Aptos" w:hAnsi="Aptos" w:eastAsia="Aptos" w:cs="Aptos"/>
                 <w:b/>
                 <w:color w:val="344E8C"/>
@@ -4208,6 +4505,15 @@
             <w:r/>
             <w:r>
               <w:rPr>
+                <w:rFonts w:ascii="Segoe UI Emoji" w:hAnsi="Segoe UI Emoji" w:eastAsia="Segoe UI Emoji" w:cs="Segoe UI Emoji"/>
+                <w:b/>
+                <w:color w:val="344E8C"/>
+                <w:sz w:val="21"/>
+              </w:rPr>
+              <w:t xml:space="preserve">🥈 </w:t>
+            </w:r>
+            <w:r>
+              <w:rPr>
                 <w:rFonts w:ascii="Aptos" w:hAnsi="Aptos" w:eastAsia="Aptos" w:cs="Aptos"/>
                 <w:b/>
                 <w:color w:val="344E8C"/>
@@ -4302,6 +4608,15 @@
             <w:r/>
             <w:r>
               <w:rPr>
+                <w:rFonts w:ascii="Segoe UI Emoji" w:hAnsi="Segoe UI Emoji" w:eastAsia="Segoe UI Emoji" w:cs="Segoe UI Emoji"/>
+                <w:b/>
+                <w:color w:val="344E8C"/>
+                <w:sz w:val="21"/>
+              </w:rPr>
+              <w:t xml:space="preserve">🥈 </w:t>
+            </w:r>
+            <w:r>
+              <w:rPr>
                 <w:rFonts w:ascii="Aptos" w:hAnsi="Aptos" w:eastAsia="Aptos" w:cs="Aptos"/>
                 <w:b/>
                 <w:color w:val="344E8C"/>
@@ -4394,6 +4709,15 @@
               <w:jc w:val="left"/>
             </w:pPr>
             <w:r/>
+            <w:r>
+              <w:rPr>
+                <w:rFonts w:ascii="Segoe UI Emoji" w:hAnsi="Segoe UI Emoji" w:eastAsia="Segoe UI Emoji" w:cs="Segoe UI Emoji"/>
+                <w:b/>
+                <w:color w:val="344E8C"/>
+                <w:sz w:val="21"/>
+              </w:rPr>
+              <w:t xml:space="preserve">🥈 </w:t>
+            </w:r>
             <w:r>
               <w:rPr>
                 <w:rFonts w:ascii="Aptos" w:hAnsi="Aptos" w:eastAsia="Aptos" w:cs="Aptos"/>
@@ -4480,6 +4804,15 @@
             <w:r/>
             <w:r>
               <w:rPr>
+                <w:rFonts w:ascii="Segoe UI Emoji" w:hAnsi="Segoe UI Emoji" w:eastAsia="Segoe UI Emoji" w:cs="Segoe UI Emoji"/>
+                <w:b/>
+                <w:color w:val="344E8C"/>
+                <w:sz w:val="21"/>
+              </w:rPr>
+              <w:t xml:space="preserve">🥈 </w:t>
+            </w:r>
+            <w:r>
+              <w:rPr>
                 <w:rFonts w:ascii="Aptos" w:hAnsi="Aptos" w:eastAsia="Aptos" w:cs="Aptos"/>
                 <w:b/>
                 <w:color w:val="344E8C"/>
@@ -4574,6 +4907,15 @@
             <w:r/>
             <w:r>
               <w:rPr>
+                <w:rFonts w:ascii="Segoe UI Emoji" w:hAnsi="Segoe UI Emoji" w:eastAsia="Segoe UI Emoji" w:cs="Segoe UI Emoji"/>
+                <w:b/>
+                <w:color w:val="344E8C"/>
+                <w:sz w:val="21"/>
+              </w:rPr>
+              <w:t xml:space="preserve">🥈 </w:t>
+            </w:r>
+            <w:r>
+              <w:rPr>
                 <w:rFonts w:ascii="Aptos" w:hAnsi="Aptos" w:eastAsia="Aptos" w:cs="Aptos"/>
                 <w:b/>
                 <w:color w:val="344E8C"/>
@@ -4653,6 +4995,15 @@
             <w:r/>
             <w:r>
               <w:rPr>
+                <w:rFonts w:ascii="Segoe UI Emoji" w:hAnsi="Segoe UI Emoji" w:eastAsia="Segoe UI Emoji" w:cs="Segoe UI Emoji"/>
+                <w:b/>
+                <w:color w:val="344E8C"/>
+                <w:sz w:val="21"/>
+              </w:rPr>
+              <w:t xml:space="preserve">🥈 </w:t>
+            </w:r>
+            <w:r>
+              <w:rPr>
                 <w:rFonts w:ascii="Aptos" w:hAnsi="Aptos" w:eastAsia="Aptos" w:cs="Aptos"/>
                 <w:b/>
                 <w:color w:val="344E8C"/>
@@ -4730,6 +5081,15 @@
           <w:sz w:val="14"/>
         </w:rPr>
         <w:t xml:space="preserve"> • Full doses and evidence notes: README.md</w:t>
+      </w:r>
+      <w:r>
+        <w:rPr>
+          <w:rFonts w:ascii="Segoe UI Emoji" w:hAnsi="Segoe UI Emoji" w:eastAsia="Segoe UI Emoji" w:cs="Segoe UI Emoji"/>
+          <w:b w:val="0"/>
+          <w:color w:val="536176"/>
+          <w:sz w:val="13"/>
+        </w:rPr>
+        <w:t xml:space="preserve"> • 🥇 strongest • 🥈 supportive • 🥉 exploratory</w:t>
       </w:r>
     </w:p>
     <w:p>
@@ -4872,6 +5232,15 @@
             <w:r/>
             <w:r>
               <w:rPr>
+                <w:rFonts w:ascii="Segoe UI Emoji" w:hAnsi="Segoe UI Emoji" w:eastAsia="Segoe UI Emoji" w:cs="Segoe UI Emoji"/>
+                <w:b/>
+                <w:color w:val="344E8C"/>
+                <w:sz w:val="21"/>
+              </w:rPr>
+              <w:t xml:space="preserve">🥈 </w:t>
+            </w:r>
+            <w:r>
+              <w:rPr>
                 <w:rFonts w:ascii="Aptos" w:hAnsi="Aptos" w:eastAsia="Aptos" w:cs="Aptos"/>
                 <w:b/>
                 <w:color w:val="344E8C"/>
@@ -4951,6 +5320,15 @@
             <w:r/>
             <w:r>
               <w:rPr>
+                <w:rFonts w:ascii="Segoe UI Emoji" w:hAnsi="Segoe UI Emoji" w:eastAsia="Segoe UI Emoji" w:cs="Segoe UI Emoji"/>
+                <w:b/>
+                <w:color w:val="344E8C"/>
+                <w:sz w:val="21"/>
+              </w:rPr>
+              <w:t xml:space="preserve">🥈 </w:t>
+            </w:r>
+            <w:r>
+              <w:rPr>
                 <w:rFonts w:ascii="Aptos" w:hAnsi="Aptos" w:eastAsia="Aptos" w:cs="Aptos"/>
                 <w:b/>
                 <w:color w:val="344E8C"/>
@@ -5028,6 +5406,15 @@
               <w:jc w:val="left"/>
             </w:pPr>
             <w:r/>
+            <w:r>
+              <w:rPr>
+                <w:rFonts w:ascii="Segoe UI Emoji" w:hAnsi="Segoe UI Emoji" w:eastAsia="Segoe UI Emoji" w:cs="Segoe UI Emoji"/>
+                <w:b/>
+                <w:color w:val="344E8C"/>
+                <w:sz w:val="21"/>
+              </w:rPr>
+              <w:t xml:space="preserve">🥈 </w:t>
+            </w:r>
             <w:r>
               <w:rPr>
                 <w:rFonts w:ascii="Aptos" w:hAnsi="Aptos" w:eastAsia="Aptos" w:cs="Aptos"/>
@@ -5114,6 +5501,15 @@
             <w:r/>
             <w:r>
               <w:rPr>
+                <w:rFonts w:ascii="Segoe UI Emoji" w:hAnsi="Segoe UI Emoji" w:eastAsia="Segoe UI Emoji" w:cs="Segoe UI Emoji"/>
+                <w:b/>
+                <w:color w:val="344E8C"/>
+                <w:sz w:val="21"/>
+              </w:rPr>
+              <w:t xml:space="preserve">🥈 </w:t>
+            </w:r>
+            <w:r>
+              <w:rPr>
                 <w:rFonts w:ascii="Aptos" w:hAnsi="Aptos" w:eastAsia="Aptos" w:cs="Aptos"/>
                 <w:b/>
                 <w:color w:val="344E8C"/>
@@ -5256,6 +5652,15 @@
               <w:jc w:val="left"/>
             </w:pPr>
             <w:r/>
+            <w:r>
+              <w:rPr>
+                <w:rFonts w:ascii="Segoe UI Emoji" w:hAnsi="Segoe UI Emoji" w:eastAsia="Segoe UI Emoji" w:cs="Segoe UI Emoji"/>
+                <w:b/>
+                <w:color w:val="344E8C"/>
+                <w:sz w:val="21"/>
+              </w:rPr>
+              <w:t xml:space="preserve">🥉 </w:t>
+            </w:r>
             <w:r>
               <w:rPr>
                 <w:rFonts w:ascii="Aptos" w:hAnsi="Aptos" w:eastAsia="Aptos" w:cs="Aptos"/>
@@ -5357,6 +5762,15 @@
             <w:r/>
             <w:r>
               <w:rPr>
+                <w:rFonts w:ascii="Segoe UI Emoji" w:hAnsi="Segoe UI Emoji" w:eastAsia="Segoe UI Emoji" w:cs="Segoe UI Emoji"/>
+                <w:b/>
+                <w:color w:val="344E8C"/>
+                <w:sz w:val="21"/>
+              </w:rPr>
+              <w:t xml:space="preserve">🥉 </w:t>
+            </w:r>
+            <w:r>
+              <w:rPr>
                 <w:rFonts w:ascii="Aptos" w:hAnsi="Aptos" w:eastAsia="Aptos" w:cs="Aptos"/>
                 <w:b/>
                 <w:color w:val="344E8C"/>
@@ -5436,6 +5850,15 @@
             <w:r/>
             <w:r>
               <w:rPr>
+                <w:rFonts w:ascii="Segoe UI Emoji" w:hAnsi="Segoe UI Emoji" w:eastAsia="Segoe UI Emoji" w:cs="Segoe UI Emoji"/>
+                <w:b/>
+                <w:color w:val="344E8C"/>
+                <w:sz w:val="21"/>
+              </w:rPr>
+              <w:t xml:space="preserve">🥉 </w:t>
+            </w:r>
+            <w:r>
+              <w:rPr>
                 <w:rFonts w:ascii="Aptos" w:hAnsi="Aptos" w:eastAsia="Aptos" w:cs="Aptos"/>
                 <w:b/>
                 <w:color w:val="344E8C"/>
@@ -5515,6 +5938,15 @@
             <w:r/>
             <w:r>
               <w:rPr>
+                <w:rFonts w:ascii="Segoe UI Emoji" w:hAnsi="Segoe UI Emoji" w:eastAsia="Segoe UI Emoji" w:cs="Segoe UI Emoji"/>
+                <w:b/>
+                <w:color w:val="344E8C"/>
+                <w:sz w:val="21"/>
+              </w:rPr>
+              <w:t xml:space="preserve">🥉 </w:t>
+            </w:r>
+            <w:r>
+              <w:rPr>
                 <w:rFonts w:ascii="Aptos" w:hAnsi="Aptos" w:eastAsia="Aptos" w:cs="Aptos"/>
                 <w:b/>
                 <w:color w:val="344E8C"/>
@@ -5592,6 +6024,15 @@
           <w:sz w:val="14"/>
         </w:rPr>
         <w:t xml:space="preserve"> • Full doses and evidence notes: README.md</w:t>
+      </w:r>
+      <w:r>
+        <w:rPr>
+          <w:rFonts w:ascii="Segoe UI Emoji" w:hAnsi="Segoe UI Emoji" w:eastAsia="Segoe UI Emoji" w:cs="Segoe UI Emoji"/>
+          <w:b w:val="0"/>
+          <w:color w:val="536176"/>
+          <w:sz w:val="13"/>
+        </w:rPr>
+        <w:t xml:space="preserve"> • 🥇 strongest • 🥈 supportive • 🥉 exploratory</w:t>
       </w:r>
     </w:p>
     <w:p>
@@ -5734,6 +6175,15 @@
             <w:r/>
             <w:r>
               <w:rPr>
+                <w:rFonts w:ascii="Segoe UI Emoji" w:hAnsi="Segoe UI Emoji" w:eastAsia="Segoe UI Emoji" w:cs="Segoe UI Emoji"/>
+                <w:b/>
+                <w:color w:val="8A3FFC"/>
+                <w:sz w:val="21"/>
+              </w:rPr>
+              <w:t xml:space="preserve">🥈 </w:t>
+            </w:r>
+            <w:r>
+              <w:rPr>
                 <w:rFonts w:ascii="Aptos" w:hAnsi="Aptos" w:eastAsia="Aptos" w:cs="Aptos"/>
                 <w:b/>
                 <w:color w:val="8A3FFC"/>
@@ -5828,6 +6278,15 @@
             <w:r/>
             <w:r>
               <w:rPr>
+                <w:rFonts w:ascii="Segoe UI Emoji" w:hAnsi="Segoe UI Emoji" w:eastAsia="Segoe UI Emoji" w:cs="Segoe UI Emoji"/>
+                <w:b/>
+                <w:color w:val="8A3FFC"/>
+                <w:sz w:val="21"/>
+              </w:rPr>
+              <w:t xml:space="preserve">🥈 </w:t>
+            </w:r>
+            <w:r>
+              <w:rPr>
                 <w:rFonts w:ascii="Aptos" w:hAnsi="Aptos" w:eastAsia="Aptos" w:cs="Aptos"/>
                 <w:b/>
                 <w:color w:val="8A3FFC"/>
@@ -5920,6 +6379,15 @@
               <w:jc w:val="left"/>
             </w:pPr>
             <w:r/>
+            <w:r>
+              <w:rPr>
+                <w:rFonts w:ascii="Segoe UI Emoji" w:hAnsi="Segoe UI Emoji" w:eastAsia="Segoe UI Emoji" w:cs="Segoe UI Emoji"/>
+                <w:b/>
+                <w:color w:val="8A3FFC"/>
+                <w:sz w:val="21"/>
+              </w:rPr>
+              <w:t xml:space="preserve">🥈 </w:t>
+            </w:r>
             <w:r>
               <w:rPr>
                 <w:rFonts w:ascii="Aptos" w:hAnsi="Aptos" w:eastAsia="Aptos" w:cs="Aptos"/>
@@ -6006,6 +6474,15 @@
             <w:r/>
             <w:r>
               <w:rPr>
+                <w:rFonts w:ascii="Segoe UI Emoji" w:hAnsi="Segoe UI Emoji" w:eastAsia="Segoe UI Emoji" w:cs="Segoe UI Emoji"/>
+                <w:b/>
+                <w:color w:val="8A3FFC"/>
+                <w:sz w:val="21"/>
+              </w:rPr>
+              <w:t xml:space="preserve">🥈 </w:t>
+            </w:r>
+            <w:r>
+              <w:rPr>
                 <w:rFonts w:ascii="Aptos" w:hAnsi="Aptos" w:eastAsia="Aptos" w:cs="Aptos"/>
                 <w:b/>
                 <w:color w:val="8A3FFC"/>
@@ -6100,6 +6577,15 @@
             <w:r/>
             <w:r>
               <w:rPr>
+                <w:rFonts w:ascii="Segoe UI Emoji" w:hAnsi="Segoe UI Emoji" w:eastAsia="Segoe UI Emoji" w:cs="Segoe UI Emoji"/>
+                <w:b/>
+                <w:color w:val="8A3FFC"/>
+                <w:sz w:val="21"/>
+              </w:rPr>
+              <w:t xml:space="preserve">🥈 </w:t>
+            </w:r>
+            <w:r>
+              <w:rPr>
                 <w:rFonts w:ascii="Aptos" w:hAnsi="Aptos" w:eastAsia="Aptos" w:cs="Aptos"/>
                 <w:b/>
                 <w:color w:val="8A3FFC"/>
@@ -6120,7 +6606,7 @@
                 <w:color w:val="162236"/>
                 <w:sz w:val="24"/>
               </w:rPr>
-              <w:t>Tribulus Terrestris</w:t>
+              <w:t>2x Fenugreek Seed Extract</w:t>
             </w:r>
           </w:p>
           <w:p>
@@ -6135,7 +6621,7 @@
                 <w:color w:val="8A3FFC"/>
                 <w:sz w:val="18"/>
               </w:rPr>
-              <w:t>1,500mg</w:t>
+              <w:t>300mg</w:t>
             </w:r>
           </w:p>
           <w:p>
@@ -6149,7 +6635,22 @@
                 <w:b w:val="0"/>
                 <w:sz w:val="20"/>
               </w:rPr>
-              <w:t>🍆</w:t>
+              <w:t>🍆 🩸 🚽</w:t>
+            </w:r>
+          </w:p>
+          <w:p>
+            <w:pPr>
+              <w:spacing w:before="20" w:after="0" w:line="228" w:lineRule="auto"/>
+              <w:jc w:val="center"/>
+            </w:pPr>
+            <w:r>
+              <w:rPr>
+                <w:rFonts w:ascii="Aptos" w:hAnsi="Aptos" w:eastAsia="Aptos" w:cs="Aptos"/>
+                <w:b w:val="0"/>
+                <w:color w:val="536176"/>
+                <w:sz w:val="15"/>
+              </w:rPr>
+              <w:t>Testofen® • Fenuside™ saponins 150mg (50%)</w:t>
             </w:r>
           </w:p>
         </w:tc>
@@ -6179,6 +6680,15 @@
             <w:r/>
             <w:r>
               <w:rPr>
+                <w:rFonts w:ascii="Segoe UI Emoji" w:hAnsi="Segoe UI Emoji" w:eastAsia="Segoe UI Emoji" w:cs="Segoe UI Emoji"/>
+                <w:b/>
+                <w:color w:val="8A3FFC"/>
+                <w:sz w:val="21"/>
+              </w:rPr>
+              <w:t xml:space="preserve">🥉 </w:t>
+            </w:r>
+            <w:r>
+              <w:rPr>
                 <w:rFonts w:ascii="Aptos" w:hAnsi="Aptos" w:eastAsia="Aptos" w:cs="Aptos"/>
                 <w:b/>
                 <w:color w:val="8A3FFC"/>
@@ -6199,7 +6709,7 @@
                 <w:color w:val="162236"/>
                 <w:sz w:val="24"/>
               </w:rPr>
-              <w:t>Fenugreek</w:t>
+              <w:t>Tribulus Terrestris</w:t>
             </w:r>
           </w:p>
           <w:p>
@@ -6214,7 +6724,7 @@
                 <w:color w:val="8A3FFC"/>
                 <w:sz w:val="18"/>
               </w:rPr>
-              <w:t>750mg</w:t>
+              <w:t>1,500mg</w:t>
             </w:r>
           </w:p>
           <w:p>
@@ -6228,7 +6738,7 @@
                 <w:b w:val="0"/>
                 <w:sz w:val="20"/>
               </w:rPr>
-              <w:t>🍆 🚽</w:t>
+              <w:t>🍆</w:t>
             </w:r>
           </w:p>
         </w:tc>
@@ -6263,6 +6773,15 @@
             <w:r/>
             <w:r>
               <w:rPr>
+                <w:rFonts w:ascii="Segoe UI Emoji" w:hAnsi="Segoe UI Emoji" w:eastAsia="Segoe UI Emoji" w:cs="Segoe UI Emoji"/>
+                <w:b/>
+                <w:color w:val="8A3FFC"/>
+                <w:sz w:val="21"/>
+              </w:rPr>
+              <w:t xml:space="preserve">🥉 </w:t>
+            </w:r>
+            <w:r>
+              <w:rPr>
                 <w:rFonts w:ascii="Aptos" w:hAnsi="Aptos" w:eastAsia="Aptos" w:cs="Aptos"/>
                 <w:b/>
                 <w:color w:val="8A3FFC"/>
@@ -6342,6 +6861,15 @@
             <w:r/>
             <w:r>
               <w:rPr>
+                <w:rFonts w:ascii="Segoe UI Emoji" w:hAnsi="Segoe UI Emoji" w:eastAsia="Segoe UI Emoji" w:cs="Segoe UI Emoji"/>
+                <w:b/>
+                <w:color w:val="8A3FFC"/>
+                <w:sz w:val="21"/>
+              </w:rPr>
+              <w:t xml:space="preserve">🥉 </w:t>
+            </w:r>
+            <w:r>
+              <w:rPr>
                 <w:rFonts w:ascii="Aptos" w:hAnsi="Aptos" w:eastAsia="Aptos" w:cs="Aptos"/>
                 <w:b/>
                 <w:color w:val="8A3FFC"/>
@@ -6421,6 +6949,15 @@
             <w:r/>
             <w:r>
               <w:rPr>
+                <w:rFonts w:ascii="Segoe UI Emoji" w:hAnsi="Segoe UI Emoji" w:eastAsia="Segoe UI Emoji" w:cs="Segoe UI Emoji"/>
+                <w:b/>
+                <w:color w:val="8A3FFC"/>
+                <w:sz w:val="21"/>
+              </w:rPr>
+              <w:t xml:space="preserve">🥉 </w:t>
+            </w:r>
+            <w:r>
+              <w:rPr>
                 <w:rFonts w:ascii="Aptos" w:hAnsi="Aptos" w:eastAsia="Aptos" w:cs="Aptos"/>
                 <w:b/>
                 <w:color w:val="8A3FFC"/>
@@ -6498,6 +7035,15 @@
           <w:sz w:val="14"/>
         </w:rPr>
         <w:t xml:space="preserve"> • Full doses and evidence notes: README.md</w:t>
+      </w:r>
+      <w:r>
+        <w:rPr>
+          <w:rFonts w:ascii="Segoe UI Emoji" w:hAnsi="Segoe UI Emoji" w:eastAsia="Segoe UI Emoji" w:cs="Segoe UI Emoji"/>
+          <w:b w:val="0"/>
+          <w:color w:val="536176"/>
+          <w:sz w:val="13"/>
+        </w:rPr>
+        <w:t xml:space="preserve"> • 🥇 strongest • 🥈 supportive • 🥉 exploratory</w:t>
       </w:r>
     </w:p>
     <w:p>
@@ -6640,6 +7186,15 @@
             <w:r/>
             <w:r>
               <w:rPr>
+                <w:rFonts w:ascii="Segoe UI Emoji" w:hAnsi="Segoe UI Emoji" w:eastAsia="Segoe UI Emoji" w:cs="Segoe UI Emoji"/>
+                <w:b/>
+                <w:color w:val="087F5B"/>
+                <w:sz w:val="21"/>
+              </w:rPr>
+              <w:t xml:space="preserve">🥈 </w:t>
+            </w:r>
+            <w:r>
+              <w:rPr>
                 <w:rFonts w:ascii="Aptos" w:hAnsi="Aptos" w:eastAsia="Aptos" w:cs="Aptos"/>
                 <w:b/>
                 <w:color w:val="087F5B"/>
@@ -6734,6 +7289,15 @@
             <w:r/>
             <w:r>
               <w:rPr>
+                <w:rFonts w:ascii="Segoe UI Emoji" w:hAnsi="Segoe UI Emoji" w:eastAsia="Segoe UI Emoji" w:cs="Segoe UI Emoji"/>
+                <w:b/>
+                <w:color w:val="087F5B"/>
+                <w:sz w:val="21"/>
+              </w:rPr>
+              <w:t xml:space="preserve">🥈 </w:t>
+            </w:r>
+            <w:r>
+              <w:rPr>
                 <w:rFonts w:ascii="Aptos" w:hAnsi="Aptos" w:eastAsia="Aptos" w:cs="Aptos"/>
                 <w:b/>
                 <w:color w:val="087F5B"/>
@@ -6811,6 +7375,15 @@
               <w:jc w:val="left"/>
             </w:pPr>
             <w:r/>
+            <w:r>
+              <w:rPr>
+                <w:rFonts w:ascii="Segoe UI Emoji" w:hAnsi="Segoe UI Emoji" w:eastAsia="Segoe UI Emoji" w:cs="Segoe UI Emoji"/>
+                <w:b/>
+                <w:color w:val="087F5B"/>
+                <w:sz w:val="21"/>
+              </w:rPr>
+              <w:t xml:space="preserve">🥈 </w:t>
+            </w:r>
             <w:r>
               <w:rPr>
                 <w:rFonts w:ascii="Aptos" w:hAnsi="Aptos" w:eastAsia="Aptos" w:cs="Aptos"/>
@@ -6897,6 +7470,15 @@
             <w:r/>
             <w:r>
               <w:rPr>
+                <w:rFonts w:ascii="Segoe UI Emoji" w:hAnsi="Segoe UI Emoji" w:eastAsia="Segoe UI Emoji" w:cs="Segoe UI Emoji"/>
+                <w:b/>
+                <w:color w:val="087F5B"/>
+                <w:sz w:val="21"/>
+              </w:rPr>
+              <w:t xml:space="preserve">🥈 </w:t>
+            </w:r>
+            <w:r>
+              <w:rPr>
                 <w:rFonts w:ascii="Aptos" w:hAnsi="Aptos" w:eastAsia="Aptos" w:cs="Aptos"/>
                 <w:b/>
                 <w:color w:val="087F5B"/>
@@ -7241,6 +7823,15 @@
             <w:r/>
             <w:r>
               <w:rPr>
+                <w:rFonts w:ascii="Segoe UI Emoji" w:hAnsi="Segoe UI Emoji" w:eastAsia="Segoe UI Emoji" w:cs="Segoe UI Emoji"/>
+                <w:b/>
+                <w:color w:val="087F5B"/>
+                <w:sz w:val="21"/>
+              </w:rPr>
+              <w:t xml:space="preserve">🥈 </w:t>
+            </w:r>
+            <w:r>
+              <w:rPr>
                 <w:rFonts w:ascii="Aptos" w:hAnsi="Aptos" w:eastAsia="Aptos" w:cs="Aptos"/>
                 <w:b/>
                 <w:color w:val="087F5B"/>
@@ -7318,6 +7909,15 @@
           <w:sz w:val="14"/>
         </w:rPr>
         <w:t xml:space="preserve"> • Full doses and evidence notes: README.md</w:t>
+      </w:r>
+      <w:r>
+        <w:rPr>
+          <w:rFonts w:ascii="Segoe UI Emoji" w:hAnsi="Segoe UI Emoji" w:eastAsia="Segoe UI Emoji" w:cs="Segoe UI Emoji"/>
+          <w:b w:val="0"/>
+          <w:color w:val="536176"/>
+          <w:sz w:val="13"/>
+        </w:rPr>
+        <w:t xml:space="preserve"> • 🥇 strongest • 🥈 supportive • 🥉 exploratory</w:t>
       </w:r>
     </w:p>
     <w:sectPr>

</xml_diff>